<commit_message>
Fase 1: autoevaluacion de competencias y diario de reflexion de Felipe Millan
</commit_message>
<xml_diff>
--- a/Fase 1/Evidencias Individuales/Millan_Felipe_1.2_APT122_DiarioReflexionFase1.docx
+++ b/Fase 1/Evidencias Individuales/Millan_Felipe_1.2_APT122_DiarioReflexionFase1.docx
@@ -1,6 +1,6 @@
 
 <file path=word/document.xml><?xml version="1.0" encoding="utf-8"?>
-<w:document xmlns:wpc="http://schemas.microsoft.com/office/word/2010/wordprocessingCanvas" xmlns:cx="http://schemas.microsoft.com/office/drawing/2014/chartex" xmlns:mc="http://schemas.openxmlformats.org/markup-compatibility/2006" xmlns:o="urn:schemas-microsoft-com:office:office" xmlns:r="http://schemas.openxmlformats.org/officeDocument/2006/relationships" xmlns:m="http://schemas.openxmlformats.org/officeDocument/2006/math" xmlns:v="urn:schemas-microsoft-com:vml" xmlns:wp14="http://schemas.microsoft.com/office/word/2010/wordprocessingDrawing" xmlns:wp="http://schemas.openxmlformats.org/drawingml/2006/wordprocessingDrawing" xmlns:w10="urn:schemas-microsoft-com:office:word" xmlns:w="http://schemas.openxmlformats.org/wordprocessingml/2006/main" xmlns:w14="http://schemas.microsoft.com/office/word/2010/wordml" xmlns:w15="http://schemas.microsoft.com/office/word/2012/wordml" xmlns:w16se="http://schemas.microsoft.com/office/word/2015/wordml/symex" xmlns:wpg="http://schemas.microsoft.com/office/word/2010/wordprocessingGroup" xmlns:wpi="http://schemas.microsoft.com/office/word/2010/wordprocessingInk" xmlns:wne="http://schemas.microsoft.com/office/word/2006/wordml" xmlns:wps="http://schemas.microsoft.com/office/word/2010/wordprocessingShape" mc:Ignorable="w14 w15 w16se wp14">
+<w:document xmlns:wpc="http://schemas.microsoft.com/office/word/2010/wordprocessingCanvas" xmlns:cx="http://schemas.microsoft.com/office/drawing/2014/chartex" xmlns:cx1="http://schemas.microsoft.com/office/drawing/2015/9/8/chartex" xmlns:cx2="http://schemas.microsoft.com/office/drawing/2015/10/21/chartex" xmlns:cx3="http://schemas.microsoft.com/office/drawing/2016/5/9/chartex" xmlns:cx4="http://schemas.microsoft.com/office/drawing/2016/5/10/chartex" xmlns:cx5="http://schemas.microsoft.com/office/drawing/2016/5/11/chartex" xmlns:cx6="http://schemas.microsoft.com/office/drawing/2016/5/12/chartex" xmlns:cx7="http://schemas.microsoft.com/office/drawing/2016/5/13/chartex" xmlns:cx8="http://schemas.microsoft.com/office/drawing/2016/5/14/chartex" xmlns:mc="http://schemas.openxmlformats.org/markup-compatibility/2006" xmlns:aink="http://schemas.microsoft.com/office/drawing/2016/ink" xmlns:am3d="http://schemas.microsoft.com/office/drawing/2017/model3d" xmlns:o="urn:schemas-microsoft-com:office:office" xmlns:oel="http://schemas.microsoft.com/office/2019/extlst" xmlns:r="http://schemas.openxmlformats.org/officeDocument/2006/relationships" xmlns:m="http://schemas.openxmlformats.org/officeDocument/2006/math" xmlns:v="urn:schemas-microsoft-com:vml" xmlns:wp14="http://schemas.microsoft.com/office/word/2010/wordprocessingDrawing" xmlns:wp="http://schemas.openxmlformats.org/drawingml/2006/wordprocessingDrawing" xmlns:w10="urn:schemas-microsoft-com:office:word" xmlns:w="http://schemas.openxmlformats.org/wordprocessingml/2006/main" xmlns:w14="http://schemas.microsoft.com/office/word/2010/wordml" xmlns:w15="http://schemas.microsoft.com/office/word/2012/wordml" xmlns:w16cex="http://schemas.microsoft.com/office/word/2018/wordml/cex" xmlns:w16cid="http://schemas.microsoft.com/office/word/2016/wordml/cid" xmlns:w16="http://schemas.microsoft.com/office/word/2018/wordml" xmlns:w16du="http://schemas.microsoft.com/office/word/2023/wordml/word16du" xmlns:w16sdtdh="http://schemas.microsoft.com/office/word/2020/wordml/sdtdatahash" xmlns:w16sdtfl="http://schemas.microsoft.com/office/word/2024/wordml/sdtformatlock" xmlns:w16se="http://schemas.microsoft.com/office/word/2015/wordml/symex" xmlns:wpg="http://schemas.microsoft.com/office/word/2010/wordprocessingGroup" xmlns:wpi="http://schemas.microsoft.com/office/word/2010/wordprocessingInk" xmlns:wne="http://schemas.microsoft.com/office/word/2006/wordml" xmlns:wps="http://schemas.microsoft.com/office/word/2010/wordprocessingShape" mc:Ignorable="w14 w15 w16se w16cid w16 w16cex w16sdtdh w16sdtfl w16du wp14">
   <w:body>
     <w:p/>
     <w:tbl>
@@ -364,12 +364,64 @@
             <w:r>
               <w:rPr>
                 <w:rFonts w:ascii="Calibri" w:hAnsi="Calibri"/>
-                <w:b w:val="0"/>
-                <w:i w:val="0"/>
                 <w:color w:val="1F1F1F"/>
                 <w:sz w:val="20"/>
               </w:rPr>
-              <w:t>Las asignaturas que más me gustaron fueron las de programación, porque me permiten construir cosas desde cero y ver el resultado funcionando. También disfruté Fundamentos de Machine Learning, Machine Learning y Deep Learning, donde aprendí a entrenar y evaluar modelos con métricas reales, y las asignaturas de bases de datos, que hoy aplico en mi práctica.</w:t>
+              <w:t xml:space="preserve">Las asignaturas que más me gustaron fueron las de programación, porque me permiten construir cosas desde cero y ver el resultado funcionando. También disfruté Fundamentos de Machine </w:t>
+            </w:r>
+            <w:proofErr w:type="spellStart"/>
+            <w:r>
+              <w:rPr>
+                <w:rFonts w:ascii="Calibri" w:hAnsi="Calibri"/>
+                <w:color w:val="1F1F1F"/>
+                <w:sz w:val="20"/>
+              </w:rPr>
+              <w:t>Learning</w:t>
+            </w:r>
+            <w:proofErr w:type="spellEnd"/>
+            <w:r>
+              <w:rPr>
+                <w:rFonts w:ascii="Calibri" w:hAnsi="Calibri"/>
+                <w:color w:val="1F1F1F"/>
+                <w:sz w:val="20"/>
+              </w:rPr>
+              <w:t xml:space="preserve">, Machine </w:t>
+            </w:r>
+            <w:proofErr w:type="spellStart"/>
+            <w:r>
+              <w:rPr>
+                <w:rFonts w:ascii="Calibri" w:hAnsi="Calibri"/>
+                <w:color w:val="1F1F1F"/>
+                <w:sz w:val="20"/>
+              </w:rPr>
+              <w:t>Learning</w:t>
+            </w:r>
+            <w:proofErr w:type="spellEnd"/>
+            <w:r>
+              <w:rPr>
+                <w:rFonts w:ascii="Calibri" w:hAnsi="Calibri"/>
+                <w:color w:val="1F1F1F"/>
+                <w:sz w:val="20"/>
+              </w:rPr>
+              <w:t xml:space="preserve"> y Deep </w:t>
+            </w:r>
+            <w:proofErr w:type="spellStart"/>
+            <w:r>
+              <w:rPr>
+                <w:rFonts w:ascii="Calibri" w:hAnsi="Calibri"/>
+                <w:color w:val="1F1F1F"/>
+                <w:sz w:val="20"/>
+              </w:rPr>
+              <w:t>Learning</w:t>
+            </w:r>
+            <w:proofErr w:type="spellEnd"/>
+            <w:r>
+              <w:rPr>
+                <w:rFonts w:ascii="Calibri" w:hAnsi="Calibri"/>
+                <w:color w:val="1F1F1F"/>
+                <w:sz w:val="20"/>
+              </w:rPr>
+              <w:t>, donde aprendí a entrenar y evaluar modelos con métricas reales, y las asignaturas de bases de datos, que hoy aplico en mi práctica.</w:t>
             </w:r>
           </w:p>
           <w:p>
@@ -468,12 +520,28 @@
             <w:r>
               <w:rPr>
                 <w:rFonts w:ascii="Calibri" w:hAnsi="Calibri"/>
-                <w:b w:val="0"/>
-                <w:i w:val="0"/>
                 <w:color w:val="1F1F1F"/>
                 <w:sz w:val="20"/>
               </w:rPr>
-              <w:t>Sí. Obtuve las certificaciones de Programación de Software, Arquitectura de Software, Calidad de Software, Gestión de Proyectos Informáticos, Análisis y Planificación de Requerimientos Informáticos, Análisis y Desarrollo de Modelos de Datos, Inteligencia de Negocios e Inglés Intermedio Alto (internacional). Ordenan lo aprendido en bloques que un empleador puede reconocer y respaldan mi perfil de desarrollo. Aun así, creo que su mayor valor aparece cuando se acompañan de proyectos concretos, como el Capstone, que demuestren lo que sé hacer.</w:t>
+              <w:t xml:space="preserve">Sí. Obtuve las certificaciones de Programación de Software, Arquitectura de Software, Calidad de Software, Gestión de Proyectos Informáticos, Análisis y Planificación de Requerimientos Informáticos, Análisis y Desarrollo de Modelos de Datos, Inteligencia de Negocios e Inglés Intermedio Alto (internacional). Ordenan lo aprendido en bloques que un empleador puede reconocer y respaldan mi perfil de desarrollo. Aun así, creo que su mayor valor aparece cuando se acompañan de proyectos concretos, como el </w:t>
+            </w:r>
+            <w:proofErr w:type="spellStart"/>
+            <w:r>
+              <w:rPr>
+                <w:rFonts w:ascii="Calibri" w:hAnsi="Calibri"/>
+                <w:color w:val="1F1F1F"/>
+                <w:sz w:val="20"/>
+              </w:rPr>
+              <w:t>Capstone</w:t>
+            </w:r>
+            <w:proofErr w:type="spellEnd"/>
+            <w:r>
+              <w:rPr>
+                <w:rFonts w:ascii="Calibri" w:hAnsi="Calibri"/>
+                <w:color w:val="1F1F1F"/>
+                <w:sz w:val="20"/>
+              </w:rPr>
+              <w:t>, que demuestren lo que sé hacer.</w:t>
             </w:r>
           </w:p>
           <w:p>
@@ -685,7 +753,6 @@
                 <w:sz w:val="24"/>
                 <w:szCs w:val="24"/>
               </w:rPr>
-              <w:lastRenderedPageBreak/>
               <w:t xml:space="preserve">2. Revisa las competencias y unidades de competencias correspondientes a cada asignatura de la malla de tu carrera. Marca en </w:t>
             </w:r>
             <w:r>
@@ -838,8 +905,6 @@
             <w:r>
               <w:rPr>
                 <w:rFonts w:ascii="Calibri" w:hAnsi="Calibri"/>
-                <w:b w:val="0"/>
-                <w:i w:val="0"/>
                 <w:color w:val="1F1F1F"/>
                 <w:sz w:val="20"/>
               </w:rPr>
@@ -1313,12 +1378,10 @@
             <w:r>
               <w:rPr>
                 <w:rFonts w:ascii="Calibri" w:hAnsi="Calibri"/>
-                <w:b w:val="0"/>
-                <w:i w:val="0"/>
                 <w:color w:val="1F1F1F"/>
                 <w:sz w:val="20"/>
               </w:rPr>
-              <w:t>Me interesa el desarrollo de software, en especial el desarrollo de videojuegos y de sistemas interactivos. El área de desempeño que más me atrae es el desarrollo, más que el soporte, donde hago hoy mi práctica. También me interesa la inteligencia artificial aplicada.</w:t>
+              <w:t>Me interesa el desarrollo de software, en especial el desarrollo de sistemas interactivos. El área de desempeño que más me atrae es el desarrollo, más que el soporte, donde hago hoy mi práctica. También me interesa la inteligencia artificial aplicada.</w:t>
             </w:r>
           </w:p>
           <w:p>
@@ -1470,13 +1533,39 @@
             <w:r>
               <w:rPr>
                 <w:rFonts w:ascii="Calibri" w:hAnsi="Calibri"/>
-                <w:b w:val="0"/>
-                <w:i w:val="0"/>
                 <w:color w:val="1F1F1F"/>
                 <w:sz w:val="20"/>
               </w:rPr>
-              <w:t>Se relacionan directamente con desarrollar soluciones de software, construir programas de variada complejidad y gestionar proyectos informáticos. Siento que debo fortalecer especialmente la gestión de proyectos, porque liderar un equipo exige planificar y estimar mejor, y las pruebas de software.</w:t>
+              <w:t>Se relacionan directamente con desarrollar soluciones de software, construir programas de variada complejidad y gestionar proyectos informáticos. Siento que debo fortalecer especialmente la gestión de proyectos.</w:t>
             </w:r>
+          </w:p>
+          <w:p>
+            <w:pPr>
+              <w:tabs>
+                <w:tab w:val="left" w:pos="454"/>
+              </w:tabs>
+              <w:jc w:val="both"/>
+              <w:rPr>
+                <w:rFonts w:eastAsiaTheme="majorEastAsia"/>
+                <w:color w:val="767171" w:themeColor="background2" w:themeShade="80"/>
+                <w:sz w:val="24"/>
+                <w:szCs w:val="24"/>
+              </w:rPr>
+            </w:pPr>
+          </w:p>
+          <w:p>
+            <w:pPr>
+              <w:tabs>
+                <w:tab w:val="left" w:pos="454"/>
+              </w:tabs>
+              <w:jc w:val="both"/>
+              <w:rPr>
+                <w:rFonts w:eastAsiaTheme="majorEastAsia"/>
+                <w:color w:val="767171" w:themeColor="background2" w:themeShade="80"/>
+                <w:sz w:val="24"/>
+                <w:szCs w:val="24"/>
+              </w:rPr>
+            </w:pPr>
           </w:p>
           <w:p>
             <w:pPr>
@@ -1615,6 +1704,7 @@
                 <w:sz w:val="24"/>
                 <w:szCs w:val="24"/>
               </w:rPr>
+              <w:lastRenderedPageBreak/>
               <w:t>¿Cómo te gustaría que fuera tu escenario laboral en 5 años más? ¿Qué te gustaría estar haciendo?</w:t>
             </w:r>
           </w:p>
@@ -1641,12 +1731,64 @@
             <w:r>
               <w:rPr>
                 <w:rFonts w:ascii="Calibri" w:hAnsi="Calibri"/>
-                <w:b w:val="0"/>
-                <w:i w:val="0"/>
                 <w:color w:val="1F1F1F"/>
                 <w:sz w:val="20"/>
               </w:rPr>
-              <w:t>En cinco años me gustaría estar trabajando como desarrollador de software, idealmente en la industria de los videojuegos o en un equipo de desarrollo de productos, y haber publicado de forma independiente la versión completa de Anvil of Ambition.</w:t>
+              <w:t xml:space="preserve">En cinco años me gustaría estar trabajando como desarrollador de software, idealmente en un equipo de desarrollo de productos, y haber publicado de forma independiente la versión completa de </w:t>
+            </w:r>
+            <w:proofErr w:type="spellStart"/>
+            <w:r>
+              <w:rPr>
+                <w:rFonts w:ascii="Calibri" w:hAnsi="Calibri"/>
+                <w:color w:val="1F1F1F"/>
+                <w:sz w:val="20"/>
+              </w:rPr>
+              <w:t>Anvil</w:t>
+            </w:r>
+            <w:proofErr w:type="spellEnd"/>
+            <w:r>
+              <w:rPr>
+                <w:rFonts w:ascii="Calibri" w:hAnsi="Calibri"/>
+                <w:color w:val="1F1F1F"/>
+                <w:sz w:val="20"/>
+              </w:rPr>
+              <w:t xml:space="preserve"> </w:t>
+            </w:r>
+            <w:proofErr w:type="spellStart"/>
+            <w:r>
+              <w:rPr>
+                <w:rFonts w:ascii="Calibri" w:hAnsi="Calibri"/>
+                <w:color w:val="1F1F1F"/>
+                <w:sz w:val="20"/>
+              </w:rPr>
+              <w:t>of</w:t>
+            </w:r>
+            <w:proofErr w:type="spellEnd"/>
+            <w:r>
+              <w:rPr>
+                <w:rFonts w:ascii="Calibri" w:hAnsi="Calibri"/>
+                <w:color w:val="1F1F1F"/>
+                <w:sz w:val="20"/>
+              </w:rPr>
+              <w:t xml:space="preserve"> </w:t>
+            </w:r>
+            <w:proofErr w:type="spellStart"/>
+            <w:r>
+              <w:rPr>
+                <w:rFonts w:ascii="Calibri" w:hAnsi="Calibri"/>
+                <w:color w:val="1F1F1F"/>
+                <w:sz w:val="20"/>
+              </w:rPr>
+              <w:t>Ambition</w:t>
+            </w:r>
+            <w:proofErr w:type="spellEnd"/>
+            <w:r>
+              <w:rPr>
+                <w:rFonts w:ascii="Calibri" w:hAnsi="Calibri"/>
+                <w:color w:val="1F1F1F"/>
+                <w:sz w:val="20"/>
+              </w:rPr>
+              <w:t>.</w:t>
             </w:r>
           </w:p>
           <w:p>
@@ -1911,8 +2053,6 @@
                 <w:szCs w:val="20"/>
               </w:rPr>
             </w:pPr>
-            <w:bookmarkStart w:id="0" w:name="_GoBack"/>
-            <w:bookmarkEnd w:id="0"/>
             <w:r>
               <w:rPr>
                 <w:rFonts w:eastAsiaTheme="majorEastAsia"/>
@@ -1995,74 +2135,64 @@
             <w:r>
               <w:rPr>
                 <w:rFonts w:ascii="Calibri" w:hAnsi="Calibri"/>
-                <w:b w:val="0"/>
-                <w:i w:val="0"/>
                 <w:color w:val="1F1F1F"/>
                 <w:sz w:val="20"/>
               </w:rPr>
-              <w:t>En el curso anterior diseñé un sistema de gestión y sugerencia de inventario para locales de comida rápida, con un bot que recomendaba qué comprar a los administradores recién ascendidos, para que no tuvieran problemas al hacer los pedidos. Se quedó en idea, pero sí se relaciona con mis proyecciones: combina desarrollo de software, automatización y análisis de datos, áreas que me interesan.</w:t>
+              <w:t xml:space="preserve">Sí. Dentro del equipo presentamos tres ideas y el docente eligió el videojuego </w:t>
             </w:r>
-          </w:p>
-          <w:p>
-            <w:pPr>
-              <w:pStyle w:val="Prrafodelista"/>
-              <w:numPr>
-                <w:ilvl w:val="0"/>
-                <w:numId w:val="12"/>
-              </w:numPr>
-              <w:tabs>
-                <w:tab w:val="left" w:pos="454"/>
-              </w:tabs>
-              <w:spacing w:before="80" w:after="160"/>
-              <w:ind w:left="454" w:hanging="283"/>
-              <w:jc w:val="both"/>
-              <w:rPr>
-                <w:rFonts w:eastAsiaTheme="majorEastAsia"/>
-                <w:color w:val="767171" w:themeColor="background2" w:themeShade="80"/>
-                <w:sz w:val="24"/>
-                <w:szCs w:val="24"/>
-              </w:rPr>
-            </w:pPr>
+            <w:proofErr w:type="spellStart"/>
             <w:r>
               <w:rPr>
                 <w:rFonts w:ascii="Calibri" w:hAnsi="Calibri"/>
-                <w:b w:val="0"/>
-                <w:i w:val="0"/>
                 <w:color w:val="1F1F1F"/>
                 <w:sz w:val="20"/>
               </w:rPr>
-              <w:t>De hecho, hoy en mi práctica me pidieron justamente un sistema automático de gestión de inventario, lo que confirma que ese tipo de problema es real y relevante en el campo laboral. Esa línea se relaciona más con el desarrollo de soluciones empresariales que estoy aplicando en la práctica.</w:t>
+              <w:t>Anvil</w:t>
             </w:r>
-          </w:p>
-          <w:p>
-            <w:pPr>
-              <w:pStyle w:val="Prrafodelista"/>
-              <w:numPr>
-                <w:ilvl w:val="0"/>
-                <w:numId w:val="12"/>
-              </w:numPr>
-              <w:tabs>
-                <w:tab w:val="left" w:pos="454"/>
-              </w:tabs>
-              <w:spacing w:before="80" w:after="160"/>
-              <w:ind w:left="454" w:hanging="283"/>
-              <w:jc w:val="both"/>
-              <w:rPr>
-                <w:rFonts w:eastAsiaTheme="majorEastAsia"/>
-                <w:color w:val="767171" w:themeColor="background2" w:themeShade="80"/>
-                <w:sz w:val="24"/>
-                <w:szCs w:val="24"/>
-              </w:rPr>
-            </w:pPr>
+            <w:proofErr w:type="spellEnd"/>
             <w:r>
               <w:rPr>
                 <w:rFonts w:ascii="Calibri" w:hAnsi="Calibri"/>
-                <w:b w:val="0"/>
-                <w:i w:val="0"/>
                 <w:color w:val="1F1F1F"/>
                 <w:sz w:val="20"/>
               </w:rPr>
-              <w:t>Para el Capstone, en cambio, el equipo presentó tres ideas y el docente eligió el videojuego Anvil of Ambition, que se relaciona con mi otro interés profesional: el desarrollo de videojuegos. Requirió un ajuste: el docente pidió un enfoque didáctico, por lo que lo orientamos a apoyar a estudiantes de metalurgia, y acotamos el alcance a un corte vertical realista para el semestre.</w:t>
+              <w:t xml:space="preserve"> </w:t>
+            </w:r>
+            <w:proofErr w:type="spellStart"/>
+            <w:r>
+              <w:rPr>
+                <w:rFonts w:ascii="Calibri" w:hAnsi="Calibri"/>
+                <w:color w:val="1F1F1F"/>
+                <w:sz w:val="20"/>
+              </w:rPr>
+              <w:t>of</w:t>
+            </w:r>
+            <w:proofErr w:type="spellEnd"/>
+            <w:r>
+              <w:rPr>
+                <w:rFonts w:ascii="Calibri" w:hAnsi="Calibri"/>
+                <w:color w:val="1F1F1F"/>
+                <w:sz w:val="20"/>
+              </w:rPr>
+              <w:t xml:space="preserve"> </w:t>
+            </w:r>
+            <w:proofErr w:type="spellStart"/>
+            <w:r>
+              <w:rPr>
+                <w:rFonts w:ascii="Calibri" w:hAnsi="Calibri"/>
+                <w:color w:val="1F1F1F"/>
+                <w:sz w:val="20"/>
+              </w:rPr>
+              <w:t>Ambition</w:t>
+            </w:r>
+            <w:proofErr w:type="spellEnd"/>
+            <w:r>
+              <w:rPr>
+                <w:rFonts w:ascii="Calibri" w:hAnsi="Calibri"/>
+                <w:color w:val="1F1F1F"/>
+                <w:sz w:val="20"/>
+              </w:rPr>
+              <w:t>, que es la que más se relaciona con mi proyección profesional. Requirió un ajuste: el docente pidió que el juego tuviera un enfoque didáctico, por lo que lo orientamos a apoyar a estudiantes de metalurgia: el juego les permite ver los distintos minerales, cuáles se pueden forjar y a qué temperatura son maleables, y acotamos el alcance a un corte vertical realista para el semestre.</w:t>
             </w:r>
           </w:p>
           <w:p>
@@ -2116,6 +2246,19 @@
               <w:rPr>
                 <w:rFonts w:eastAsiaTheme="majorEastAsia"/>
                 <w:color w:val="767171" w:themeColor="background2" w:themeShade="80"/>
+                <w:sz w:val="24"/>
+                <w:szCs w:val="24"/>
+              </w:rPr>
+            </w:pPr>
+          </w:p>
+          <w:p>
+            <w:pPr>
+              <w:tabs>
+                <w:tab w:val="left" w:pos="454"/>
+              </w:tabs>
+              <w:jc w:val="both"/>
+              <w:rPr>
+                <w:rFonts w:eastAsiaTheme="majorEastAsia"/>
                 <w:sz w:val="24"/>
                 <w:szCs w:val="24"/>
               </w:rPr>
@@ -2212,6 +2355,7 @@
                 <w:sz w:val="24"/>
                 <w:szCs w:val="24"/>
               </w:rPr>
+              <w:lastRenderedPageBreak/>
               <w:t xml:space="preserve">Si no hay ninguna que se relacione suficiente: </w:t>
             </w:r>
           </w:p>
@@ -2474,7 +2618,7 @@
 </file>
 
 <file path=word/endnotes.xml><?xml version="1.0" encoding="utf-8"?>
-<w:endnotes xmlns:wpc="http://schemas.microsoft.com/office/word/2010/wordprocessingCanvas" xmlns:cx="http://schemas.microsoft.com/office/drawing/2014/chartex" xmlns:mc="http://schemas.openxmlformats.org/markup-compatibility/2006" xmlns:o="urn:schemas-microsoft-com:office:office" xmlns:r="http://schemas.openxmlformats.org/officeDocument/2006/relationships" xmlns:m="http://schemas.openxmlformats.org/officeDocument/2006/math" xmlns:v="urn:schemas-microsoft-com:vml" xmlns:wp14="http://schemas.microsoft.com/office/word/2010/wordprocessingDrawing" xmlns:wp="http://schemas.openxmlformats.org/drawingml/2006/wordprocessingDrawing" xmlns:w10="urn:schemas-microsoft-com:office:word" xmlns:w="http://schemas.openxmlformats.org/wordprocessingml/2006/main" xmlns:w14="http://schemas.microsoft.com/office/word/2010/wordml" xmlns:w15="http://schemas.microsoft.com/office/word/2012/wordml" xmlns:w16se="http://schemas.microsoft.com/office/word/2015/wordml/symex" xmlns:wpg="http://schemas.microsoft.com/office/word/2010/wordprocessingGroup" xmlns:wpi="http://schemas.microsoft.com/office/word/2010/wordprocessingInk" xmlns:wne="http://schemas.microsoft.com/office/word/2006/wordml" xmlns:wps="http://schemas.microsoft.com/office/word/2010/wordprocessingShape" mc:Ignorable="w14 w15 w16se wp14">
+<w:endnotes xmlns:wpc="http://schemas.microsoft.com/office/word/2010/wordprocessingCanvas" xmlns:cx="http://schemas.microsoft.com/office/drawing/2014/chartex" xmlns:cx1="http://schemas.microsoft.com/office/drawing/2015/9/8/chartex" xmlns:cx2="http://schemas.microsoft.com/office/drawing/2015/10/21/chartex" xmlns:cx3="http://schemas.microsoft.com/office/drawing/2016/5/9/chartex" xmlns:cx4="http://schemas.microsoft.com/office/drawing/2016/5/10/chartex" xmlns:cx5="http://schemas.microsoft.com/office/drawing/2016/5/11/chartex" xmlns:cx6="http://schemas.microsoft.com/office/drawing/2016/5/12/chartex" xmlns:cx7="http://schemas.microsoft.com/office/drawing/2016/5/13/chartex" xmlns:cx8="http://schemas.microsoft.com/office/drawing/2016/5/14/chartex" xmlns:mc="http://schemas.openxmlformats.org/markup-compatibility/2006" xmlns:aink="http://schemas.microsoft.com/office/drawing/2016/ink" xmlns:am3d="http://schemas.microsoft.com/office/drawing/2017/model3d" xmlns:o="urn:schemas-microsoft-com:office:office" xmlns:oel="http://schemas.microsoft.com/office/2019/extlst" xmlns:r="http://schemas.openxmlformats.org/officeDocument/2006/relationships" xmlns:m="http://schemas.openxmlformats.org/officeDocument/2006/math" xmlns:v="urn:schemas-microsoft-com:vml" xmlns:wp14="http://schemas.microsoft.com/office/word/2010/wordprocessingDrawing" xmlns:wp="http://schemas.openxmlformats.org/drawingml/2006/wordprocessingDrawing" xmlns:w10="urn:schemas-microsoft-com:office:word" xmlns:w="http://schemas.openxmlformats.org/wordprocessingml/2006/main" xmlns:w14="http://schemas.microsoft.com/office/word/2010/wordml" xmlns:w15="http://schemas.microsoft.com/office/word/2012/wordml" xmlns:w16cex="http://schemas.microsoft.com/office/word/2018/wordml/cex" xmlns:w16cid="http://schemas.microsoft.com/office/word/2016/wordml/cid" xmlns:w16="http://schemas.microsoft.com/office/word/2018/wordml" xmlns:w16du="http://schemas.microsoft.com/office/word/2023/wordml/word16du" xmlns:w16sdtdh="http://schemas.microsoft.com/office/word/2020/wordml/sdtdatahash" xmlns:w16sdtfl="http://schemas.microsoft.com/office/word/2024/wordml/sdtformatlock" xmlns:w16se="http://schemas.microsoft.com/office/word/2015/wordml/symex" xmlns:wpg="http://schemas.microsoft.com/office/word/2010/wordprocessingGroup" xmlns:wpi="http://schemas.microsoft.com/office/word/2010/wordprocessingInk" xmlns:wne="http://schemas.microsoft.com/office/word/2006/wordml" xmlns:wps="http://schemas.microsoft.com/office/word/2010/wordprocessingShape" mc:Ignorable="w14 w15 w16se w16cid w16 w16cex w16sdtdh w16sdtfl w16du wp14">
   <w:endnote w:type="separator" w:id="-1">
     <w:p>
       <w:pPr>
@@ -2499,7 +2643,7 @@
 </file>
 
 <file path=word/footer1.xml><?xml version="1.0" encoding="utf-8"?>
-<w:ftr xmlns:wpc="http://schemas.microsoft.com/office/word/2010/wordprocessingCanvas" xmlns:cx="http://schemas.microsoft.com/office/drawing/2014/chartex" xmlns:mc="http://schemas.openxmlformats.org/markup-compatibility/2006" xmlns:o="urn:schemas-microsoft-com:office:office" xmlns:r="http://schemas.openxmlformats.org/officeDocument/2006/relationships" xmlns:m="http://schemas.openxmlformats.org/officeDocument/2006/math" xmlns:v="urn:schemas-microsoft-com:vml" xmlns:wp14="http://schemas.microsoft.com/office/word/2010/wordprocessingDrawing" xmlns:wp="http://schemas.openxmlformats.org/drawingml/2006/wordprocessingDrawing" xmlns:w10="urn:schemas-microsoft-com:office:word" xmlns:w="http://schemas.openxmlformats.org/wordprocessingml/2006/main" xmlns:w14="http://schemas.microsoft.com/office/word/2010/wordml" xmlns:w15="http://schemas.microsoft.com/office/word/2012/wordml" xmlns:w16se="http://schemas.microsoft.com/office/word/2015/wordml/symex" xmlns:wpg="http://schemas.microsoft.com/office/word/2010/wordprocessingGroup" xmlns:wpi="http://schemas.microsoft.com/office/word/2010/wordprocessingInk" xmlns:wne="http://schemas.microsoft.com/office/word/2006/wordml" xmlns:wps="http://schemas.microsoft.com/office/word/2010/wordprocessingShape" mc:Ignorable="w14 w15 w16se wp14">
+<w:ftr xmlns:wpc="http://schemas.microsoft.com/office/word/2010/wordprocessingCanvas" xmlns:cx="http://schemas.microsoft.com/office/drawing/2014/chartex" xmlns:cx1="http://schemas.microsoft.com/office/drawing/2015/9/8/chartex" xmlns:cx2="http://schemas.microsoft.com/office/drawing/2015/10/21/chartex" xmlns:cx3="http://schemas.microsoft.com/office/drawing/2016/5/9/chartex" xmlns:cx4="http://schemas.microsoft.com/office/drawing/2016/5/10/chartex" xmlns:cx5="http://schemas.microsoft.com/office/drawing/2016/5/11/chartex" xmlns:cx6="http://schemas.microsoft.com/office/drawing/2016/5/12/chartex" xmlns:cx7="http://schemas.microsoft.com/office/drawing/2016/5/13/chartex" xmlns:cx8="http://schemas.microsoft.com/office/drawing/2016/5/14/chartex" xmlns:mc="http://schemas.openxmlformats.org/markup-compatibility/2006" xmlns:aink="http://schemas.microsoft.com/office/drawing/2016/ink" xmlns:am3d="http://schemas.microsoft.com/office/drawing/2017/model3d" xmlns:o="urn:schemas-microsoft-com:office:office" xmlns:oel="http://schemas.microsoft.com/office/2019/extlst" xmlns:r="http://schemas.openxmlformats.org/officeDocument/2006/relationships" xmlns:m="http://schemas.openxmlformats.org/officeDocument/2006/math" xmlns:v="urn:schemas-microsoft-com:vml" xmlns:wp14="http://schemas.microsoft.com/office/word/2010/wordprocessingDrawing" xmlns:wp="http://schemas.openxmlformats.org/drawingml/2006/wordprocessingDrawing" xmlns:w10="urn:schemas-microsoft-com:office:word" xmlns:w="http://schemas.openxmlformats.org/wordprocessingml/2006/main" xmlns:w14="http://schemas.microsoft.com/office/word/2010/wordml" xmlns:w15="http://schemas.microsoft.com/office/word/2012/wordml" xmlns:w16cex="http://schemas.microsoft.com/office/word/2018/wordml/cex" xmlns:w16cid="http://schemas.microsoft.com/office/word/2016/wordml/cid" xmlns:w16="http://schemas.microsoft.com/office/word/2018/wordml" xmlns:w16du="http://schemas.microsoft.com/office/word/2023/wordml/word16du" xmlns:w16sdtdh="http://schemas.microsoft.com/office/word/2020/wordml/sdtdatahash" xmlns:w16sdtfl="http://schemas.microsoft.com/office/word/2024/wordml/sdtformatlock" xmlns:w16se="http://schemas.microsoft.com/office/word/2015/wordml/symex" xmlns:wpg="http://schemas.microsoft.com/office/word/2010/wordprocessingGroup" xmlns:wpi="http://schemas.microsoft.com/office/word/2010/wordprocessingInk" xmlns:wne="http://schemas.microsoft.com/office/word/2006/wordml" xmlns:wps="http://schemas.microsoft.com/office/word/2010/wordprocessingShape" mc:Ignorable="w14 w15 w16se w16cid w16 w16cex w16sdtdh w16sdtfl w16du wp14">
   <w:sdt>
     <w:sdtPr>
       <w:id w:val="-937982979"/>
@@ -2508,7 +2652,6 @@
         <w:docPartUnique/>
       </w:docPartObj>
     </w:sdtPr>
-    <w:sdtEndPr/>
     <w:sdtContent>
       <w:p>
         <w:pPr>
@@ -2787,7 +2930,7 @@
 </file>
 
 <file path=word/footnotes.xml><?xml version="1.0" encoding="utf-8"?>
-<w:footnotes xmlns:wpc="http://schemas.microsoft.com/office/word/2010/wordprocessingCanvas" xmlns:cx="http://schemas.microsoft.com/office/drawing/2014/chartex" xmlns:mc="http://schemas.openxmlformats.org/markup-compatibility/2006" xmlns:o="urn:schemas-microsoft-com:office:office" xmlns:r="http://schemas.openxmlformats.org/officeDocument/2006/relationships" xmlns:m="http://schemas.openxmlformats.org/officeDocument/2006/math" xmlns:v="urn:schemas-microsoft-com:vml" xmlns:wp14="http://schemas.microsoft.com/office/word/2010/wordprocessingDrawing" xmlns:wp="http://schemas.openxmlformats.org/drawingml/2006/wordprocessingDrawing" xmlns:w10="urn:schemas-microsoft-com:office:word" xmlns:w="http://schemas.openxmlformats.org/wordprocessingml/2006/main" xmlns:w14="http://schemas.microsoft.com/office/word/2010/wordml" xmlns:w15="http://schemas.microsoft.com/office/word/2012/wordml" xmlns:w16se="http://schemas.microsoft.com/office/word/2015/wordml/symex" xmlns:wpg="http://schemas.microsoft.com/office/word/2010/wordprocessingGroup" xmlns:wpi="http://schemas.microsoft.com/office/word/2010/wordprocessingInk" xmlns:wne="http://schemas.microsoft.com/office/word/2006/wordml" xmlns:wps="http://schemas.microsoft.com/office/word/2010/wordprocessingShape" mc:Ignorable="w14 w15 w16se wp14">
+<w:footnotes xmlns:wpc="http://schemas.microsoft.com/office/word/2010/wordprocessingCanvas" xmlns:cx="http://schemas.microsoft.com/office/drawing/2014/chartex" xmlns:cx1="http://schemas.microsoft.com/office/drawing/2015/9/8/chartex" xmlns:cx2="http://schemas.microsoft.com/office/drawing/2015/10/21/chartex" xmlns:cx3="http://schemas.microsoft.com/office/drawing/2016/5/9/chartex" xmlns:cx4="http://schemas.microsoft.com/office/drawing/2016/5/10/chartex" xmlns:cx5="http://schemas.microsoft.com/office/drawing/2016/5/11/chartex" xmlns:cx6="http://schemas.microsoft.com/office/drawing/2016/5/12/chartex" xmlns:cx7="http://schemas.microsoft.com/office/drawing/2016/5/13/chartex" xmlns:cx8="http://schemas.microsoft.com/office/drawing/2016/5/14/chartex" xmlns:mc="http://schemas.openxmlformats.org/markup-compatibility/2006" xmlns:aink="http://schemas.microsoft.com/office/drawing/2016/ink" xmlns:am3d="http://schemas.microsoft.com/office/drawing/2017/model3d" xmlns:o="urn:schemas-microsoft-com:office:office" xmlns:oel="http://schemas.microsoft.com/office/2019/extlst" xmlns:r="http://schemas.openxmlformats.org/officeDocument/2006/relationships" xmlns:m="http://schemas.openxmlformats.org/officeDocument/2006/math" xmlns:v="urn:schemas-microsoft-com:vml" xmlns:wp14="http://schemas.microsoft.com/office/word/2010/wordprocessingDrawing" xmlns:wp="http://schemas.openxmlformats.org/drawingml/2006/wordprocessingDrawing" xmlns:w10="urn:schemas-microsoft-com:office:word" xmlns:w="http://schemas.openxmlformats.org/wordprocessingml/2006/main" xmlns:w14="http://schemas.microsoft.com/office/word/2010/wordml" xmlns:w15="http://schemas.microsoft.com/office/word/2012/wordml" xmlns:w16cex="http://schemas.microsoft.com/office/word/2018/wordml/cex" xmlns:w16cid="http://schemas.microsoft.com/office/word/2016/wordml/cid" xmlns:w16="http://schemas.microsoft.com/office/word/2018/wordml" xmlns:w16du="http://schemas.microsoft.com/office/word/2023/wordml/word16du" xmlns:w16sdtdh="http://schemas.microsoft.com/office/word/2020/wordml/sdtdatahash" xmlns:w16sdtfl="http://schemas.microsoft.com/office/word/2024/wordml/sdtformatlock" xmlns:w16se="http://schemas.microsoft.com/office/word/2015/wordml/symex" xmlns:wpg="http://schemas.microsoft.com/office/word/2010/wordprocessingGroup" xmlns:wpi="http://schemas.microsoft.com/office/word/2010/wordprocessingInk" xmlns:wne="http://schemas.microsoft.com/office/word/2006/wordml" xmlns:wps="http://schemas.microsoft.com/office/word/2010/wordprocessingShape" mc:Ignorable="w14 w15 w16se w16cid w16 w16cex w16sdtdh w16sdtfl w16du wp14">
   <w:footnote w:type="separator" w:id="-1">
     <w:p>
       <w:pPr>
@@ -2812,7 +2955,7 @@
 </file>
 
 <file path=word/header1.xml><?xml version="1.0" encoding="utf-8"?>
-<w:hdr xmlns:wpc="http://schemas.microsoft.com/office/word/2010/wordprocessingCanvas" xmlns:cx="http://schemas.microsoft.com/office/drawing/2014/chartex" xmlns:mc="http://schemas.openxmlformats.org/markup-compatibility/2006" xmlns:o="urn:schemas-microsoft-com:office:office" xmlns:r="http://schemas.openxmlformats.org/officeDocument/2006/relationships" xmlns:m="http://schemas.openxmlformats.org/officeDocument/2006/math" xmlns:v="urn:schemas-microsoft-com:vml" xmlns:wp14="http://schemas.microsoft.com/office/word/2010/wordprocessingDrawing" xmlns:wp="http://schemas.openxmlformats.org/drawingml/2006/wordprocessingDrawing" xmlns:w10="urn:schemas-microsoft-com:office:word" xmlns:w="http://schemas.openxmlformats.org/wordprocessingml/2006/main" xmlns:w14="http://schemas.microsoft.com/office/word/2010/wordml" xmlns:w15="http://schemas.microsoft.com/office/word/2012/wordml" xmlns:w16se="http://schemas.microsoft.com/office/word/2015/wordml/symex" xmlns:wpg="http://schemas.microsoft.com/office/word/2010/wordprocessingGroup" xmlns:wpi="http://schemas.microsoft.com/office/word/2010/wordprocessingInk" xmlns:wne="http://schemas.microsoft.com/office/word/2006/wordml" xmlns:wps="http://schemas.microsoft.com/office/word/2010/wordprocessingShape" mc:Ignorable="w14 w15 w16se wp14">
+<w:hdr xmlns:wpc="http://schemas.microsoft.com/office/word/2010/wordprocessingCanvas" xmlns:cx="http://schemas.microsoft.com/office/drawing/2014/chartex" xmlns:cx1="http://schemas.microsoft.com/office/drawing/2015/9/8/chartex" xmlns:cx2="http://schemas.microsoft.com/office/drawing/2015/10/21/chartex" xmlns:cx3="http://schemas.microsoft.com/office/drawing/2016/5/9/chartex" xmlns:cx4="http://schemas.microsoft.com/office/drawing/2016/5/10/chartex" xmlns:cx5="http://schemas.microsoft.com/office/drawing/2016/5/11/chartex" xmlns:cx6="http://schemas.microsoft.com/office/drawing/2016/5/12/chartex" xmlns:cx7="http://schemas.microsoft.com/office/drawing/2016/5/13/chartex" xmlns:cx8="http://schemas.microsoft.com/office/drawing/2016/5/14/chartex" xmlns:mc="http://schemas.openxmlformats.org/markup-compatibility/2006" xmlns:aink="http://schemas.microsoft.com/office/drawing/2016/ink" xmlns:am3d="http://schemas.microsoft.com/office/drawing/2017/model3d" xmlns:o="urn:schemas-microsoft-com:office:office" xmlns:oel="http://schemas.microsoft.com/office/2019/extlst" xmlns:r="http://schemas.openxmlformats.org/officeDocument/2006/relationships" xmlns:m="http://schemas.openxmlformats.org/officeDocument/2006/math" xmlns:v="urn:schemas-microsoft-com:vml" xmlns:wp14="http://schemas.microsoft.com/office/word/2010/wordprocessingDrawing" xmlns:wp="http://schemas.openxmlformats.org/drawingml/2006/wordprocessingDrawing" xmlns:w10="urn:schemas-microsoft-com:office:word" xmlns:w="http://schemas.openxmlformats.org/wordprocessingml/2006/main" xmlns:w14="http://schemas.microsoft.com/office/word/2010/wordml" xmlns:w15="http://schemas.microsoft.com/office/word/2012/wordml" xmlns:w16cex="http://schemas.microsoft.com/office/word/2018/wordml/cex" xmlns:w16cid="http://schemas.microsoft.com/office/word/2016/wordml/cid" xmlns:w16="http://schemas.microsoft.com/office/word/2018/wordml" xmlns:w16du="http://schemas.microsoft.com/office/word/2023/wordml/word16du" xmlns:w16sdtdh="http://schemas.microsoft.com/office/word/2020/wordml/sdtdatahash" xmlns:w16sdtfl="http://schemas.microsoft.com/office/word/2024/wordml/sdtformatlock" xmlns:w16se="http://schemas.microsoft.com/office/word/2015/wordml/symex" xmlns:wpg="http://schemas.microsoft.com/office/word/2010/wordprocessingGroup" xmlns:wpi="http://schemas.microsoft.com/office/word/2010/wordprocessingInk" xmlns:wne="http://schemas.microsoft.com/office/word/2006/wordml" xmlns:wps="http://schemas.microsoft.com/office/word/2010/wordprocessingShape" mc:Ignorable="w14 w15 w16se w16cid w16 w16cex w16sdtdh w16sdtfl w16du wp14">
   <w:tbl>
     <w:tblPr>
       <w:tblStyle w:val="Tablaconcuadrcula"/>
@@ -2982,7 +3125,7 @@
 </file>
 
 <file path=word/header2.xml><?xml version="1.0" encoding="utf-8"?>
-<w:hdr xmlns:wpc="http://schemas.microsoft.com/office/word/2010/wordprocessingCanvas" xmlns:cx="http://schemas.microsoft.com/office/drawing/2014/chartex" xmlns:mc="http://schemas.openxmlformats.org/markup-compatibility/2006" xmlns:o="urn:schemas-microsoft-com:office:office" xmlns:r="http://schemas.openxmlformats.org/officeDocument/2006/relationships" xmlns:m="http://schemas.openxmlformats.org/officeDocument/2006/math" xmlns:v="urn:schemas-microsoft-com:vml" xmlns:wp14="http://schemas.microsoft.com/office/word/2010/wordprocessingDrawing" xmlns:wp="http://schemas.openxmlformats.org/drawingml/2006/wordprocessingDrawing" xmlns:w10="urn:schemas-microsoft-com:office:word" xmlns:w="http://schemas.openxmlformats.org/wordprocessingml/2006/main" xmlns:w14="http://schemas.microsoft.com/office/word/2010/wordml" xmlns:w15="http://schemas.microsoft.com/office/word/2012/wordml" xmlns:w16se="http://schemas.microsoft.com/office/word/2015/wordml/symex" xmlns:wpg="http://schemas.microsoft.com/office/word/2010/wordprocessingGroup" xmlns:wpi="http://schemas.microsoft.com/office/word/2010/wordprocessingInk" xmlns:wne="http://schemas.microsoft.com/office/word/2006/wordml" xmlns:wps="http://schemas.microsoft.com/office/word/2010/wordprocessingShape" mc:Ignorable="w14 w15 w16se wp14">
+<w:hdr xmlns:wpc="http://schemas.microsoft.com/office/word/2010/wordprocessingCanvas" xmlns:cx="http://schemas.microsoft.com/office/drawing/2014/chartex" xmlns:cx1="http://schemas.microsoft.com/office/drawing/2015/9/8/chartex" xmlns:cx2="http://schemas.microsoft.com/office/drawing/2015/10/21/chartex" xmlns:cx3="http://schemas.microsoft.com/office/drawing/2016/5/9/chartex" xmlns:cx4="http://schemas.microsoft.com/office/drawing/2016/5/10/chartex" xmlns:cx5="http://schemas.microsoft.com/office/drawing/2016/5/11/chartex" xmlns:cx6="http://schemas.microsoft.com/office/drawing/2016/5/12/chartex" xmlns:cx7="http://schemas.microsoft.com/office/drawing/2016/5/13/chartex" xmlns:cx8="http://schemas.microsoft.com/office/drawing/2016/5/14/chartex" xmlns:mc="http://schemas.openxmlformats.org/markup-compatibility/2006" xmlns:aink="http://schemas.microsoft.com/office/drawing/2016/ink" xmlns:am3d="http://schemas.microsoft.com/office/drawing/2017/model3d" xmlns:o="urn:schemas-microsoft-com:office:office" xmlns:oel="http://schemas.microsoft.com/office/2019/extlst" xmlns:r="http://schemas.openxmlformats.org/officeDocument/2006/relationships" xmlns:m="http://schemas.openxmlformats.org/officeDocument/2006/math" xmlns:v="urn:schemas-microsoft-com:vml" xmlns:wp14="http://schemas.microsoft.com/office/word/2010/wordprocessingDrawing" xmlns:wp="http://schemas.openxmlformats.org/drawingml/2006/wordprocessingDrawing" xmlns:w10="urn:schemas-microsoft-com:office:word" xmlns:w="http://schemas.openxmlformats.org/wordprocessingml/2006/main" xmlns:w14="http://schemas.microsoft.com/office/word/2010/wordml" xmlns:w15="http://schemas.microsoft.com/office/word/2012/wordml" xmlns:w16cex="http://schemas.microsoft.com/office/word/2018/wordml/cex" xmlns:w16cid="http://schemas.microsoft.com/office/word/2016/wordml/cid" xmlns:w16="http://schemas.microsoft.com/office/word/2018/wordml" xmlns:w16du="http://schemas.microsoft.com/office/word/2023/wordml/word16du" xmlns:w16sdtdh="http://schemas.microsoft.com/office/word/2020/wordml/sdtdatahash" xmlns:w16sdtfl="http://schemas.microsoft.com/office/word/2024/wordml/sdtformatlock" xmlns:w16se="http://schemas.microsoft.com/office/word/2015/wordml/symex" xmlns:wpg="http://schemas.microsoft.com/office/word/2010/wordprocessingGroup" xmlns:wpi="http://schemas.microsoft.com/office/word/2010/wordprocessingInk" xmlns:wne="http://schemas.microsoft.com/office/word/2006/wordml" xmlns:wps="http://schemas.microsoft.com/office/word/2010/wordprocessingShape" mc:Ignorable="w14 w15 w16se w16cid w16 w16cex w16sdtdh w16sdtfl w16du wp14">
   <w:tbl>
     <w:tblPr>
       <w:tblStyle w:val="Tablaconcuadrcula"/>
@@ -3255,7 +3398,7 @@
 </file>
 
 <file path=word/numbering.xml><?xml version="1.0" encoding="utf-8"?>
-<w:numbering xmlns:wpc="http://schemas.microsoft.com/office/word/2010/wordprocessingCanvas" xmlns:cx="http://schemas.microsoft.com/office/drawing/2014/chartex" xmlns:mc="http://schemas.openxmlformats.org/markup-compatibility/2006" xmlns:o="urn:schemas-microsoft-com:office:office" xmlns:r="http://schemas.openxmlformats.org/officeDocument/2006/relationships" xmlns:m="http://schemas.openxmlformats.org/officeDocument/2006/math" xmlns:v="urn:schemas-microsoft-com:vml" xmlns:wp14="http://schemas.microsoft.com/office/word/2010/wordprocessingDrawing" xmlns:wp="http://schemas.openxmlformats.org/drawingml/2006/wordprocessingDrawing" xmlns:w10="urn:schemas-microsoft-com:office:word" xmlns:w="http://schemas.openxmlformats.org/wordprocessingml/2006/main" xmlns:w14="http://schemas.microsoft.com/office/word/2010/wordml" xmlns:w15="http://schemas.microsoft.com/office/word/2012/wordml" xmlns:w16se="http://schemas.microsoft.com/office/word/2015/wordml/symex" xmlns:wpg="http://schemas.microsoft.com/office/word/2010/wordprocessingGroup" xmlns:wpi="http://schemas.microsoft.com/office/word/2010/wordprocessingInk" xmlns:wne="http://schemas.microsoft.com/office/word/2006/wordml" xmlns:wps="http://schemas.microsoft.com/office/word/2010/wordprocessingShape" mc:Ignorable="w14 w15 w16se wp14">
+<w:numbering xmlns:wpc="http://schemas.microsoft.com/office/word/2010/wordprocessingCanvas" xmlns:cx="http://schemas.microsoft.com/office/drawing/2014/chartex" xmlns:cx1="http://schemas.microsoft.com/office/drawing/2015/9/8/chartex" xmlns:cx2="http://schemas.microsoft.com/office/drawing/2015/10/21/chartex" xmlns:cx3="http://schemas.microsoft.com/office/drawing/2016/5/9/chartex" xmlns:cx4="http://schemas.microsoft.com/office/drawing/2016/5/10/chartex" xmlns:cx5="http://schemas.microsoft.com/office/drawing/2016/5/11/chartex" xmlns:cx6="http://schemas.microsoft.com/office/drawing/2016/5/12/chartex" xmlns:cx7="http://schemas.microsoft.com/office/drawing/2016/5/13/chartex" xmlns:cx8="http://schemas.microsoft.com/office/drawing/2016/5/14/chartex" xmlns:mc="http://schemas.openxmlformats.org/markup-compatibility/2006" xmlns:aink="http://schemas.microsoft.com/office/drawing/2016/ink" xmlns:am3d="http://schemas.microsoft.com/office/drawing/2017/model3d" xmlns:o="urn:schemas-microsoft-com:office:office" xmlns:oel="http://schemas.microsoft.com/office/2019/extlst" xmlns:r="http://schemas.openxmlformats.org/officeDocument/2006/relationships" xmlns:m="http://schemas.openxmlformats.org/officeDocument/2006/math" xmlns:v="urn:schemas-microsoft-com:vml" xmlns:wp14="http://schemas.microsoft.com/office/word/2010/wordprocessingDrawing" xmlns:wp="http://schemas.openxmlformats.org/drawingml/2006/wordprocessingDrawing" xmlns:w10="urn:schemas-microsoft-com:office:word" xmlns:w="http://schemas.openxmlformats.org/wordprocessingml/2006/main" xmlns:w14="http://schemas.microsoft.com/office/word/2010/wordml" xmlns:w15="http://schemas.microsoft.com/office/word/2012/wordml" xmlns:w16cex="http://schemas.microsoft.com/office/word/2018/wordml/cex" xmlns:w16cid="http://schemas.microsoft.com/office/word/2016/wordml/cid" xmlns:w16="http://schemas.microsoft.com/office/word/2018/wordml" xmlns:w16du="http://schemas.microsoft.com/office/word/2023/wordml/word16du" xmlns:w16sdtdh="http://schemas.microsoft.com/office/word/2020/wordml/sdtdatahash" xmlns:w16sdtfl="http://schemas.microsoft.com/office/word/2024/wordml/sdtformatlock" xmlns:w16se="http://schemas.microsoft.com/office/word/2015/wordml/symex" xmlns:wpg="http://schemas.microsoft.com/office/word/2010/wordprocessingGroup" xmlns:wpi="http://schemas.microsoft.com/office/word/2010/wordprocessingInk" xmlns:wne="http://schemas.microsoft.com/office/word/2006/wordml" xmlns:wps="http://schemas.microsoft.com/office/word/2010/wordprocessingShape" mc:Ignorable="w14 w15 w16se w16cid w16 w16cex w16sdtdh w16sdtfl w16du wp14">
   <w:abstractNum w:abstractNumId="0" w15:restartNumberingAfterBreak="0">
     <w:nsid w:val="049156A1"/>
     <w:multiLevelType w:val="hybridMultilevel"/>
@@ -7829,124 +7972,124 @@
       </w:rPr>
     </w:lvl>
   </w:abstractNum>
-  <w:num w:numId="1">
+  <w:num w:numId="1" w16cid:durableId="246892088">
     <w:abstractNumId w:val="3"/>
   </w:num>
-  <w:num w:numId="2">
+  <w:num w:numId="2" w16cid:durableId="2036424950">
     <w:abstractNumId w:val="8"/>
   </w:num>
-  <w:num w:numId="3">
+  <w:num w:numId="3" w16cid:durableId="1873348175">
     <w:abstractNumId w:val="12"/>
   </w:num>
-  <w:num w:numId="4">
+  <w:num w:numId="4" w16cid:durableId="1814522421">
     <w:abstractNumId w:val="28"/>
   </w:num>
-  <w:num w:numId="5">
+  <w:num w:numId="5" w16cid:durableId="461271991">
     <w:abstractNumId w:val="30"/>
   </w:num>
-  <w:num w:numId="6">
+  <w:num w:numId="6" w16cid:durableId="1853258656">
     <w:abstractNumId w:val="4"/>
   </w:num>
-  <w:num w:numId="7">
+  <w:num w:numId="7" w16cid:durableId="1705209850">
     <w:abstractNumId w:val="11"/>
   </w:num>
-  <w:num w:numId="8">
+  <w:num w:numId="8" w16cid:durableId="1454057618">
     <w:abstractNumId w:val="19"/>
   </w:num>
-  <w:num w:numId="9">
+  <w:num w:numId="9" w16cid:durableId="1586375071">
     <w:abstractNumId w:val="15"/>
   </w:num>
-  <w:num w:numId="10">
+  <w:num w:numId="10" w16cid:durableId="305741337">
     <w:abstractNumId w:val="9"/>
   </w:num>
-  <w:num w:numId="11">
+  <w:num w:numId="11" w16cid:durableId="838615163">
     <w:abstractNumId w:val="24"/>
   </w:num>
-  <w:num w:numId="12">
+  <w:num w:numId="12" w16cid:durableId="570772854">
     <w:abstractNumId w:val="35"/>
   </w:num>
-  <w:num w:numId="13">
+  <w:num w:numId="13" w16cid:durableId="803698804">
     <w:abstractNumId w:val="29"/>
   </w:num>
-  <w:num w:numId="14">
+  <w:num w:numId="14" w16cid:durableId="1713923097">
     <w:abstractNumId w:val="1"/>
   </w:num>
-  <w:num w:numId="15">
+  <w:num w:numId="15" w16cid:durableId="1287085658">
     <w:abstractNumId w:val="36"/>
   </w:num>
-  <w:num w:numId="16">
+  <w:num w:numId="16" w16cid:durableId="531769401">
     <w:abstractNumId w:val="21"/>
   </w:num>
-  <w:num w:numId="17">
+  <w:num w:numId="17" w16cid:durableId="1903638658">
     <w:abstractNumId w:val="17"/>
   </w:num>
-  <w:num w:numId="18">
+  <w:num w:numId="18" w16cid:durableId="2099062009">
     <w:abstractNumId w:val="31"/>
   </w:num>
-  <w:num w:numId="19">
+  <w:num w:numId="19" w16cid:durableId="1812869741">
     <w:abstractNumId w:val="10"/>
   </w:num>
-  <w:num w:numId="20">
+  <w:num w:numId="20" w16cid:durableId="286392725">
     <w:abstractNumId w:val="39"/>
   </w:num>
-  <w:num w:numId="21">
+  <w:num w:numId="21" w16cid:durableId="1910847917">
     <w:abstractNumId w:val="34"/>
   </w:num>
-  <w:num w:numId="22">
+  <w:num w:numId="22" w16cid:durableId="842167372">
     <w:abstractNumId w:val="13"/>
   </w:num>
-  <w:num w:numId="23">
+  <w:num w:numId="23" w16cid:durableId="21246698">
     <w:abstractNumId w:val="14"/>
   </w:num>
-  <w:num w:numId="24">
+  <w:num w:numId="24" w16cid:durableId="1369841686">
     <w:abstractNumId w:val="5"/>
   </w:num>
-  <w:num w:numId="25">
+  <w:num w:numId="25" w16cid:durableId="2064328253">
     <w:abstractNumId w:val="16"/>
   </w:num>
-  <w:num w:numId="26">
+  <w:num w:numId="26" w16cid:durableId="2010906878">
     <w:abstractNumId w:val="20"/>
   </w:num>
-  <w:num w:numId="27">
+  <w:num w:numId="27" w16cid:durableId="272708495">
     <w:abstractNumId w:val="23"/>
   </w:num>
-  <w:num w:numId="28">
+  <w:num w:numId="28" w16cid:durableId="1381398245">
     <w:abstractNumId w:val="0"/>
   </w:num>
-  <w:num w:numId="29">
+  <w:num w:numId="29" w16cid:durableId="2755087">
     <w:abstractNumId w:val="18"/>
   </w:num>
-  <w:num w:numId="30">
+  <w:num w:numId="30" w16cid:durableId="1313094175">
     <w:abstractNumId w:val="22"/>
   </w:num>
-  <w:num w:numId="31">
+  <w:num w:numId="31" w16cid:durableId="1017778805">
     <w:abstractNumId w:val="2"/>
   </w:num>
-  <w:num w:numId="32">
+  <w:num w:numId="32" w16cid:durableId="1022049924">
     <w:abstractNumId w:val="7"/>
   </w:num>
-  <w:num w:numId="33">
+  <w:num w:numId="33" w16cid:durableId="1218511232">
     <w:abstractNumId w:val="32"/>
   </w:num>
-  <w:num w:numId="34">
+  <w:num w:numId="34" w16cid:durableId="386338336">
     <w:abstractNumId w:val="38"/>
   </w:num>
-  <w:num w:numId="35">
+  <w:num w:numId="35" w16cid:durableId="803623834">
     <w:abstractNumId w:val="6"/>
   </w:num>
-  <w:num w:numId="36">
+  <w:num w:numId="36" w16cid:durableId="227035449">
     <w:abstractNumId w:val="25"/>
   </w:num>
-  <w:num w:numId="37">
+  <w:num w:numId="37" w16cid:durableId="2007245701">
     <w:abstractNumId w:val="37"/>
   </w:num>
-  <w:num w:numId="38">
+  <w:num w:numId="38" w16cid:durableId="335966342">
     <w:abstractNumId w:val="27"/>
   </w:num>
-  <w:num w:numId="39">
+  <w:num w:numId="39" w16cid:durableId="1052728169">
     <w:abstractNumId w:val="26"/>
   </w:num>
-  <w:num w:numId="40">
+  <w:num w:numId="40" w16cid:durableId="846677622">
     <w:abstractNumId w:val="33"/>
   </w:num>
   <w:numIdMacAtCleanup w:val="18"/>
@@ -7954,7 +8097,7 @@
 </file>
 
 <file path=word/styles.xml><?xml version="1.0" encoding="utf-8"?>
-<w:styles xmlns:mc="http://schemas.openxmlformats.org/markup-compatibility/2006" xmlns:r="http://schemas.openxmlformats.org/officeDocument/2006/relationships" xmlns:w="http://schemas.openxmlformats.org/wordprocessingml/2006/main" xmlns:w14="http://schemas.microsoft.com/office/word/2010/wordml" xmlns:w15="http://schemas.microsoft.com/office/word/2012/wordml" xmlns:w16se="http://schemas.microsoft.com/office/word/2015/wordml/symex" mc:Ignorable="w14 w15 w16se">
+<w:styles xmlns:mc="http://schemas.openxmlformats.org/markup-compatibility/2006" xmlns:r="http://schemas.openxmlformats.org/officeDocument/2006/relationships" xmlns:w="http://schemas.openxmlformats.org/wordprocessingml/2006/main" xmlns:w14="http://schemas.microsoft.com/office/word/2010/wordml" xmlns:w15="http://schemas.microsoft.com/office/word/2012/wordml" xmlns:w16cex="http://schemas.microsoft.com/office/word/2018/wordml/cex" xmlns:w16cid="http://schemas.microsoft.com/office/word/2016/wordml/cid" xmlns:w16="http://schemas.microsoft.com/office/word/2018/wordml" xmlns:w16du="http://schemas.microsoft.com/office/word/2023/wordml/word16du" xmlns:w16sdtdh="http://schemas.microsoft.com/office/word/2020/wordml/sdtdatahash" xmlns:w16sdtfl="http://schemas.microsoft.com/office/word/2024/wordml/sdtformatlock" xmlns:w16se="http://schemas.microsoft.com/office/word/2015/wordml/symex" mc:Ignorable="w14 w15 w16se w16cid w16 w16cex w16sdtdh w16sdtfl w16du">
   <w:docDefaults>
     <w:rPrDefault>
       <w:rPr>
@@ -7970,7 +8113,7 @@
       </w:pPr>
     </w:pPrDefault>
   </w:docDefaults>
-  <w:latentStyles w:defLockedState="0" w:defUIPriority="99" w:defSemiHidden="0" w:defUnhideWhenUsed="0" w:defQFormat="0" w:count="371">
+  <w:latentStyles w:defLockedState="0" w:defUIPriority="99" w:defSemiHidden="0" w:defUnhideWhenUsed="0" w:defQFormat="0" w:count="376">
     <w:lsdException w:name="Normal" w:uiPriority="0" w:qFormat="1"/>
     <w:lsdException w:name="heading 1" w:uiPriority="9" w:qFormat="1"/>
     <w:lsdException w:name="heading 2" w:semiHidden="1" w:uiPriority="9" w:unhideWhenUsed="1" w:qFormat="1"/>
@@ -8342,6 +8485,11 @@
     <w:lsdException w:name="List Table 5 Dark Accent 6" w:uiPriority="50"/>
     <w:lsdException w:name="List Table 6 Colorful Accent 6" w:uiPriority="51"/>
     <w:lsdException w:name="List Table 7 Colorful Accent 6" w:uiPriority="52"/>
+    <w:lsdException w:name="Mention" w:semiHidden="1" w:unhideWhenUsed="1"/>
+    <w:lsdException w:name="Smart Hyperlink" w:semiHidden="1" w:unhideWhenUsed="1"/>
+    <w:lsdException w:name="Hashtag" w:semiHidden="1" w:unhideWhenUsed="1"/>
+    <w:lsdException w:name="Unresolved Mention" w:semiHidden="1" w:unhideWhenUsed="1"/>
+    <w:lsdException w:name="Smart Link" w:semiHidden="1" w:unhideWhenUsed="1"/>
   </w:latentStyles>
   <w:style w:type="paragraph" w:default="1" w:styleId="Normal">
     <w:name w:val="Normal"/>
@@ -9325,7 +9473,7 @@
       <w:szCs w:val="24"/>
     </w:rPr>
   </w:style>
-  <w:style w:type="table" w:styleId="Cuadrculadetablaclara">
+  <w:style w:type="table" w:styleId="Tablaconcuadrculaclara">
     <w:name w:val="Grid Table Light"/>
     <w:basedOn w:val="Tablanormal"/>
     <w:uiPriority w:val="40"/>
@@ -9347,7 +9495,7 @@
   <w:style w:type="table" w:customStyle="1" w:styleId="Cuadrculadetablaclara1">
     <w:name w:val="Cuadrícula de tabla clara1"/>
     <w:basedOn w:val="Tablanormal"/>
-    <w:next w:val="Cuadrculadetablaclara"/>
+    <w:next w:val="Tablaconcuadrculaclara"/>
     <w:uiPriority w:val="40"/>
     <w:rsid w:val="00943DF1"/>
     <w:pPr>
@@ -9388,7 +9536,7 @@
       <w:spacing w:after="0" w:line="240" w:lineRule="auto"/>
     </w:pPr>
   </w:style>
-  <w:style w:type="character" w:styleId="Textoennegrita">
+  <w:style w:type="character" w:styleId="Fuerte">
     <w:name w:val="Strong"/>
     <w:basedOn w:val="Fuentedeprrafopredeter"/>
     <w:uiPriority w:val="22"/>
@@ -9400,532 +9548,6 @@
     </w:rPr>
   </w:style>
 </w:styles>
-</file>
-
-<file path=word/glossary/document.xml><?xml version="1.0" encoding="utf-8"?>
-<w:glossaryDocument xmlns:wpc="http://schemas.microsoft.com/office/word/2010/wordprocessingCanvas" xmlns:cx="http://schemas.microsoft.com/office/drawing/2014/chartex" xmlns:mc="http://schemas.openxmlformats.org/markup-compatibility/2006" xmlns:o="urn:schemas-microsoft-com:office:office" xmlns:r="http://schemas.openxmlformats.org/officeDocument/2006/relationships" xmlns:m="http://schemas.openxmlformats.org/officeDocument/2006/math" xmlns:v="urn:schemas-microsoft-com:vml" xmlns:wp14="http://schemas.microsoft.com/office/word/2010/wordprocessingDrawing" xmlns:wp="http://schemas.openxmlformats.org/drawingml/2006/wordprocessingDrawing" xmlns:w10="urn:schemas-microsoft-com:office:word" xmlns:w="http://schemas.openxmlformats.org/wordprocessingml/2006/main" xmlns:w14="http://schemas.microsoft.com/office/word/2010/wordml" xmlns:w15="http://schemas.microsoft.com/office/word/2012/wordml" xmlns:w16se="http://schemas.microsoft.com/office/word/2015/wordml/symex" xmlns:wpg="http://schemas.microsoft.com/office/word/2010/wordprocessingGroup" xmlns:wpi="http://schemas.microsoft.com/office/word/2010/wordprocessingInk" xmlns:wne="http://schemas.microsoft.com/office/word/2006/wordml" xmlns:wps="http://schemas.microsoft.com/office/word/2010/wordprocessingShape" mc:Ignorable="w14 w15 w16se wp14"/>
-</file>
-
-<file path=word/glossary/fontTable.xml><?xml version="1.0" encoding="utf-8"?>
-<w:fonts xmlns:mc="http://schemas.openxmlformats.org/markup-compatibility/2006" xmlns:r="http://schemas.openxmlformats.org/officeDocument/2006/relationships" xmlns:w="http://schemas.openxmlformats.org/wordprocessingml/2006/main" xmlns:w14="http://schemas.microsoft.com/office/word/2010/wordml" xmlns:w15="http://schemas.microsoft.com/office/word/2012/wordml" xmlns:w16se="http://schemas.microsoft.com/office/word/2015/wordml/symex" mc:Ignorable="w14 w15 w16se">
-  <w:font w:name="Calibri">
-    <w:panose1 w:val="020F0502020204030204"/>
-    <w:charset w:val="00"/>
-    <w:family w:val="swiss"/>
-    <w:pitch w:val="variable"/>
-    <w:sig w:usb0="E4002EFF" w:usb1="C000247B" w:usb2="00000009" w:usb3="00000000" w:csb0="000001FF" w:csb1="00000000"/>
-  </w:font>
-  <w:font w:name="Times New Roman">
-    <w:panose1 w:val="02020603050405020304"/>
-    <w:charset w:val="00"/>
-    <w:family w:val="roman"/>
-    <w:pitch w:val="variable"/>
-    <w:sig w:usb0="E0002EFF" w:usb1="C000785B" w:usb2="00000009" w:usb3="00000000" w:csb0="000001FF" w:csb1="00000000"/>
-  </w:font>
-  <w:font w:name="Courier New">
-    <w:panose1 w:val="02070309020205020404"/>
-    <w:charset w:val="00"/>
-    <w:family w:val="modern"/>
-    <w:pitch w:val="fixed"/>
-    <w:sig w:usb0="E0002EFF" w:usb1="C0007843" w:usb2="00000009" w:usb3="00000000" w:csb0="000001FF" w:csb1="00000000"/>
-  </w:font>
-  <w:font w:name="Wingdings">
-    <w:panose1 w:val="05000000000000000000"/>
-    <w:charset w:val="02"/>
-    <w:family w:val="auto"/>
-    <w:pitch w:val="variable"/>
-    <w:sig w:usb0="00000000" w:usb1="10000000" w:usb2="00000000" w:usb3="00000000" w:csb0="80000000" w:csb1="00000000"/>
-  </w:font>
-  <w:font w:name="Symbol">
-    <w:panose1 w:val="05050102010706020507"/>
-    <w:charset w:val="02"/>
-    <w:family w:val="roman"/>
-    <w:pitch w:val="variable"/>
-    <w:sig w:usb0="00000000" w:usb1="10000000" w:usb2="00000000" w:usb3="00000000" w:csb0="80000000" w:csb1="00000000"/>
-  </w:font>
-  <w:font w:name="Calibri Light">
-    <w:panose1 w:val="020F0302020204030204"/>
-    <w:charset w:val="00"/>
-    <w:family w:val="swiss"/>
-    <w:pitch w:val="variable"/>
-    <w:sig w:usb0="E4002EFF" w:usb1="C000247B" w:usb2="00000009" w:usb3="00000000" w:csb0="000001FF" w:csb1="00000000"/>
-  </w:font>
-  <w:font w:name="Segoe UI">
-    <w:panose1 w:val="020B0502040204020203"/>
-    <w:charset w:val="00"/>
-    <w:family w:val="swiss"/>
-    <w:pitch w:val="variable"/>
-    <w:sig w:usb0="E4002EFF" w:usb1="C000E47F" w:usb2="00000009" w:usb3="00000000" w:csb0="000001FF" w:csb1="00000000"/>
-  </w:font>
-  <w:font w:name="Century Gothic">
-    <w:panose1 w:val="020B0502020202020204"/>
-    <w:charset w:val="00"/>
-    <w:family w:val="swiss"/>
-    <w:pitch w:val="variable"/>
-    <w:sig w:usb0="00000287" w:usb1="00000000" w:usb2="00000000" w:usb3="00000000" w:csb0="0000009F" w:csb1="00000000"/>
-  </w:font>
-</w:fonts>
-</file>
-
-<file path=word/glossary/settings.xml><?xml version="1.0" encoding="utf-8"?>
-<w:settings xmlns:mc="http://schemas.openxmlformats.org/markup-compatibility/2006" xmlns:o="urn:schemas-microsoft-com:office:office" xmlns:r="http://schemas.openxmlformats.org/officeDocument/2006/relationships" xmlns:m="http://schemas.openxmlformats.org/officeDocument/2006/math" xmlns:v="urn:schemas-microsoft-com:vml" xmlns:w10="urn:schemas-microsoft-com:office:word" xmlns:w="http://schemas.openxmlformats.org/wordprocessingml/2006/main" xmlns:w14="http://schemas.microsoft.com/office/word/2010/wordml" xmlns:w15="http://schemas.microsoft.com/office/word/2012/wordml" xmlns:w16se="http://schemas.microsoft.com/office/word/2015/wordml/symex" xmlns:sl="http://schemas.openxmlformats.org/schemaLibrary/2006/main" mc:Ignorable="w14 w15 w16se">
-  <w:defaultTabStop w:val="708"/>
-  <w:hyphenationZone w:val="425"/>
-  <w:characterSpacingControl w:val="doNotCompress"/>
-  <w:compat>
-    <w:useFELayout/>
-    <w:compatSetting w:name="compatibilityMode" w:uri="http://schemas.microsoft.com/office/word" w:val="12"/>
-  </w:compat>
-  <w:rsids>
-    <w:rsidRoot w:val="004A7892"/>
-    <w:rsid w:val="004A7892"/>
-  </w:rsids>
-  <m:mathPr>
-    <m:mathFont m:val="Cambria Math"/>
-    <m:brkBin m:val="before"/>
-    <m:brkBinSub m:val="--"/>
-    <m:smallFrac m:val="0"/>
-    <m:dispDef/>
-    <m:lMargin m:val="0"/>
-    <m:rMargin m:val="0"/>
-    <m:defJc m:val="centerGroup"/>
-    <m:wrapIndent m:val="1440"/>
-    <m:intLim m:val="subSup"/>
-    <m:naryLim m:val="undOvr"/>
-  </m:mathPr>
-  <w:themeFontLang w:val="es-CL"/>
-  <w:clrSchemeMapping w:bg1="light1" w:t1="dark1" w:bg2="light2" w:t2="dark2" w:accent1="accent1" w:accent2="accent2" w:accent3="accent3" w:accent4="accent4" w:accent5="accent5" w:accent6="accent6" w:hyperlink="hyperlink" w:followedHyperlink="followedHyperlink"/>
-  <w:decimalSymbol w:val=","/>
-  <w:listSeparator w:val=";"/>
-</w:settings>
-</file>
-
-<file path=word/glossary/styles.xml><?xml version="1.0" encoding="utf-8"?>
-<w:styles xmlns:mc="http://schemas.openxmlformats.org/markup-compatibility/2006" xmlns:r="http://schemas.openxmlformats.org/officeDocument/2006/relationships" xmlns:w="http://schemas.openxmlformats.org/wordprocessingml/2006/main" xmlns:w14="http://schemas.microsoft.com/office/word/2010/wordml" xmlns:w15="http://schemas.microsoft.com/office/word/2012/wordml" xmlns:w16se="http://schemas.microsoft.com/office/word/2015/wordml/symex" mc:Ignorable="w14 w15 w16se">
-  <w:docDefaults>
-    <w:rPrDefault>
-      <w:rPr>
-        <w:rFonts w:asciiTheme="minorHAnsi" w:eastAsiaTheme="minorEastAsia" w:hAnsiTheme="minorHAnsi" w:cstheme="minorBidi"/>
-        <w:sz w:val="22"/>
-        <w:szCs w:val="22"/>
-        <w:lang w:val="es-CL" w:eastAsia="es-CL" w:bidi="ar-SA"/>
-      </w:rPr>
-    </w:rPrDefault>
-    <w:pPrDefault>
-      <w:pPr>
-        <w:spacing w:after="160" w:line="259" w:lineRule="auto"/>
-      </w:pPr>
-    </w:pPrDefault>
-  </w:docDefaults>
-  <w:latentStyles w:defLockedState="0" w:defUIPriority="99" w:defSemiHidden="0" w:defUnhideWhenUsed="0" w:defQFormat="0" w:count="371">
-    <w:lsdException w:name="Normal" w:uiPriority="0" w:qFormat="1"/>
-    <w:lsdException w:name="heading 1" w:uiPriority="9" w:qFormat="1"/>
-    <w:lsdException w:name="heading 2" w:semiHidden="1" w:uiPriority="9" w:unhideWhenUsed="1" w:qFormat="1"/>
-    <w:lsdException w:name="heading 3" w:semiHidden="1" w:uiPriority="9" w:unhideWhenUsed="1" w:qFormat="1"/>
-    <w:lsdException w:name="heading 4" w:semiHidden="1" w:uiPriority="9" w:unhideWhenUsed="1" w:qFormat="1"/>
-    <w:lsdException w:name="heading 5" w:semiHidden="1" w:uiPriority="9" w:unhideWhenUsed="1" w:qFormat="1"/>
-    <w:lsdException w:name="heading 6" w:semiHidden="1" w:uiPriority="9" w:unhideWhenUsed="1" w:qFormat="1"/>
-    <w:lsdException w:name="heading 7" w:semiHidden="1" w:uiPriority="9" w:unhideWhenUsed="1" w:qFormat="1"/>
-    <w:lsdException w:name="heading 8" w:semiHidden="1" w:uiPriority="9" w:unhideWhenUsed="1" w:qFormat="1"/>
-    <w:lsdException w:name="heading 9" w:semiHidden="1" w:uiPriority="9" w:unhideWhenUsed="1" w:qFormat="1"/>
-    <w:lsdException w:name="index 1" w:semiHidden="1" w:unhideWhenUsed="1"/>
-    <w:lsdException w:name="index 2" w:semiHidden="1" w:unhideWhenUsed="1"/>
-    <w:lsdException w:name="index 3" w:semiHidden="1" w:unhideWhenUsed="1"/>
-    <w:lsdException w:name="index 4" w:semiHidden="1" w:unhideWhenUsed="1"/>
-    <w:lsdException w:name="index 5" w:semiHidden="1" w:unhideWhenUsed="1"/>
-    <w:lsdException w:name="index 6" w:semiHidden="1" w:unhideWhenUsed="1"/>
-    <w:lsdException w:name="index 7" w:semiHidden="1" w:unhideWhenUsed="1"/>
-    <w:lsdException w:name="index 8" w:semiHidden="1" w:unhideWhenUsed="1"/>
-    <w:lsdException w:name="index 9" w:semiHidden="1" w:unhideWhenUsed="1"/>
-    <w:lsdException w:name="toc 1" w:semiHidden="1" w:uiPriority="39" w:unhideWhenUsed="1"/>
-    <w:lsdException w:name="toc 2" w:semiHidden="1" w:uiPriority="39" w:unhideWhenUsed="1"/>
-    <w:lsdException w:name="toc 3" w:semiHidden="1" w:uiPriority="39" w:unhideWhenUsed="1"/>
-    <w:lsdException w:name="toc 4" w:semiHidden="1" w:uiPriority="39" w:unhideWhenUsed="1"/>
-    <w:lsdException w:name="toc 5" w:semiHidden="1" w:uiPriority="39" w:unhideWhenUsed="1"/>
-    <w:lsdException w:name="toc 6" w:semiHidden="1" w:uiPriority="39" w:unhideWhenUsed="1"/>
-    <w:lsdException w:name="toc 7" w:semiHidden="1" w:uiPriority="39" w:unhideWhenUsed="1"/>
-    <w:lsdException w:name="toc 8" w:semiHidden="1" w:uiPriority="39" w:unhideWhenUsed="1"/>
-    <w:lsdException w:name="toc 9" w:semiHidden="1" w:uiPriority="39" w:unhideWhenUsed="1"/>
-    <w:lsdException w:name="Normal Indent" w:semiHidden="1" w:unhideWhenUsed="1"/>
-    <w:lsdException w:name="footnote text" w:semiHidden="1" w:unhideWhenUsed="1"/>
-    <w:lsdException w:name="annotation text" w:semiHidden="1" w:unhideWhenUsed="1"/>
-    <w:lsdException w:name="header" w:semiHidden="1" w:unhideWhenUsed="1"/>
-    <w:lsdException w:name="footer" w:semiHidden="1" w:unhideWhenUsed="1"/>
-    <w:lsdException w:name="index heading" w:semiHidden="1" w:unhideWhenUsed="1"/>
-    <w:lsdException w:name="caption" w:semiHidden="1" w:uiPriority="35" w:unhideWhenUsed="1" w:qFormat="1"/>
-    <w:lsdException w:name="table of figures" w:semiHidden="1" w:unhideWhenUsed="1"/>
-    <w:lsdException w:name="envelope address" w:semiHidden="1" w:unhideWhenUsed="1"/>
-    <w:lsdException w:name="envelope return" w:semiHidden="1" w:unhideWhenUsed="1"/>
-    <w:lsdException w:name="footnote reference" w:semiHidden="1" w:unhideWhenUsed="1"/>
-    <w:lsdException w:name="annotation reference" w:semiHidden="1" w:unhideWhenUsed="1"/>
-    <w:lsdException w:name="line number" w:semiHidden="1" w:unhideWhenUsed="1"/>
-    <w:lsdException w:name="page number" w:semiHidden="1" w:unhideWhenUsed="1"/>
-    <w:lsdException w:name="endnote reference" w:semiHidden="1" w:unhideWhenUsed="1"/>
-    <w:lsdException w:name="endnote text" w:semiHidden="1" w:unhideWhenUsed="1"/>
-    <w:lsdException w:name="table of authorities" w:semiHidden="1" w:unhideWhenUsed="1"/>
-    <w:lsdException w:name="macro" w:semiHidden="1" w:unhideWhenUsed="1"/>
-    <w:lsdException w:name="toa heading" w:semiHidden="1" w:unhideWhenUsed="1"/>
-    <w:lsdException w:name="List" w:semiHidden="1" w:unhideWhenUsed="1"/>
-    <w:lsdException w:name="List Bullet" w:semiHidden="1" w:unhideWhenUsed="1"/>
-    <w:lsdException w:name="List Number" w:semiHidden="1" w:unhideWhenUsed="1"/>
-    <w:lsdException w:name="List 2" w:semiHidden="1" w:unhideWhenUsed="1"/>
-    <w:lsdException w:name="List 3" w:semiHidden="1" w:unhideWhenUsed="1"/>
-    <w:lsdException w:name="List 4" w:semiHidden="1" w:unhideWhenUsed="1"/>
-    <w:lsdException w:name="List 5" w:semiHidden="1" w:unhideWhenUsed="1"/>
-    <w:lsdException w:name="List Bullet 2" w:semiHidden="1" w:unhideWhenUsed="1"/>
-    <w:lsdException w:name="List Bullet 3" w:semiHidden="1" w:unhideWhenUsed="1"/>
-    <w:lsdException w:name="List Bullet 4" w:semiHidden="1" w:unhideWhenUsed="1"/>
-    <w:lsdException w:name="List Bullet 5" w:semiHidden="1" w:unhideWhenUsed="1"/>
-    <w:lsdException w:name="List Number 2" w:semiHidden="1" w:unhideWhenUsed="1"/>
-    <w:lsdException w:name="List Number 3" w:semiHidden="1" w:unhideWhenUsed="1"/>
-    <w:lsdException w:name="List Number 4" w:semiHidden="1" w:unhideWhenUsed="1"/>
-    <w:lsdException w:name="List Number 5" w:semiHidden="1" w:unhideWhenUsed="1"/>
-    <w:lsdException w:name="Title" w:uiPriority="10" w:qFormat="1"/>
-    <w:lsdException w:name="Closing" w:semiHidden="1" w:unhideWhenUsed="1"/>
-    <w:lsdException w:name="Signature" w:semiHidden="1" w:unhideWhenUsed="1"/>
-    <w:lsdException w:name="Default Paragraph Font" w:semiHidden="1" w:uiPriority="1" w:unhideWhenUsed="1"/>
-    <w:lsdException w:name="Body Text" w:semiHidden="1" w:unhideWhenUsed="1"/>
-    <w:lsdException w:name="Body Text Indent" w:semiHidden="1" w:unhideWhenUsed="1"/>
-    <w:lsdException w:name="List Continue" w:semiHidden="1" w:unhideWhenUsed="1"/>
-    <w:lsdException w:name="List Continue 2" w:semiHidden="1" w:unhideWhenUsed="1"/>
-    <w:lsdException w:name="List Continue 3" w:semiHidden="1" w:unhideWhenUsed="1"/>
-    <w:lsdException w:name="List Continue 4" w:semiHidden="1" w:unhideWhenUsed="1"/>
-    <w:lsdException w:name="List Continue 5" w:semiHidden="1" w:unhideWhenUsed="1"/>
-    <w:lsdException w:name="Message Header" w:semiHidden="1" w:unhideWhenUsed="1"/>
-    <w:lsdException w:name="Subtitle" w:uiPriority="11" w:qFormat="1"/>
-    <w:lsdException w:name="Salutation" w:semiHidden="1" w:unhideWhenUsed="1"/>
-    <w:lsdException w:name="Date" w:semiHidden="1" w:unhideWhenUsed="1"/>
-    <w:lsdException w:name="Body Text First Indent" w:semiHidden="1" w:unhideWhenUsed="1"/>
-    <w:lsdException w:name="Body Text First Indent 2" w:semiHidden="1" w:unhideWhenUsed="1"/>
-    <w:lsdException w:name="Note Heading" w:semiHidden="1" w:unhideWhenUsed="1"/>
-    <w:lsdException w:name="Body Text 2" w:semiHidden="1" w:unhideWhenUsed="1"/>
-    <w:lsdException w:name="Body Text 3" w:semiHidden="1" w:unhideWhenUsed="1"/>
-    <w:lsdException w:name="Body Text Indent 2" w:semiHidden="1" w:unhideWhenUsed="1"/>
-    <w:lsdException w:name="Body Text Indent 3" w:semiHidden="1" w:unhideWhenUsed="1"/>
-    <w:lsdException w:name="Block Text" w:semiHidden="1" w:unhideWhenUsed="1"/>
-    <w:lsdException w:name="Hyperlink" w:semiHidden="1" w:unhideWhenUsed="1"/>
-    <w:lsdException w:name="FollowedHyperlink" w:semiHidden="1" w:unhideWhenUsed="1"/>
-    <w:lsdException w:name="Strong" w:uiPriority="22" w:qFormat="1"/>
-    <w:lsdException w:name="Emphasis" w:uiPriority="20" w:qFormat="1"/>
-    <w:lsdException w:name="Document Map" w:semiHidden="1" w:unhideWhenUsed="1"/>
-    <w:lsdException w:name="Plain Text" w:semiHidden="1" w:unhideWhenUsed="1"/>
-    <w:lsdException w:name="E-mail Signature" w:semiHidden="1" w:unhideWhenUsed="1"/>
-    <w:lsdException w:name="HTML Top of Form" w:semiHidden="1" w:unhideWhenUsed="1"/>
-    <w:lsdException w:name="HTML Bottom of Form" w:semiHidden="1" w:unhideWhenUsed="1"/>
-    <w:lsdException w:name="Normal (Web)" w:semiHidden="1" w:unhideWhenUsed="1"/>
-    <w:lsdException w:name="HTML Acronym" w:semiHidden="1" w:unhideWhenUsed="1"/>
-    <w:lsdException w:name="HTML Address" w:semiHidden="1" w:unhideWhenUsed="1"/>
-    <w:lsdException w:name="HTML Cite" w:semiHidden="1" w:unhideWhenUsed="1"/>
-    <w:lsdException w:name="HTML Code" w:semiHidden="1" w:unhideWhenUsed="1"/>
-    <w:lsdException w:name="HTML Definition" w:semiHidden="1" w:unhideWhenUsed="1"/>
-    <w:lsdException w:name="HTML Keyboard" w:semiHidden="1" w:unhideWhenUsed="1"/>
-    <w:lsdException w:name="HTML Preformatted" w:semiHidden="1" w:unhideWhenUsed="1"/>
-    <w:lsdException w:name="HTML Sample" w:semiHidden="1" w:unhideWhenUsed="1"/>
-    <w:lsdException w:name="HTML Typewriter" w:semiHidden="1" w:unhideWhenUsed="1"/>
-    <w:lsdException w:name="HTML Variable" w:semiHidden="1" w:unhideWhenUsed="1"/>
-    <w:lsdException w:name="Normal Table" w:semiHidden="1" w:unhideWhenUsed="1"/>
-    <w:lsdException w:name="annotation subject" w:semiHidden="1" w:unhideWhenUsed="1"/>
-    <w:lsdException w:name="No List" w:semiHidden="1" w:unhideWhenUsed="1"/>
-    <w:lsdException w:name="Outline List 1" w:semiHidden="1" w:unhideWhenUsed="1"/>
-    <w:lsdException w:name="Outline List 2" w:semiHidden="1" w:unhideWhenUsed="1"/>
-    <w:lsdException w:name="Outline List 3" w:semiHidden="1" w:unhideWhenUsed="1"/>
-    <w:lsdException w:name="Table Simple 1" w:semiHidden="1" w:unhideWhenUsed="1"/>
-    <w:lsdException w:name="Table Simple 2" w:semiHidden="1" w:unhideWhenUsed="1"/>
-    <w:lsdException w:name="Table Simple 3" w:semiHidden="1" w:unhideWhenUsed="1"/>
-    <w:lsdException w:name="Table Classic 1" w:semiHidden="1" w:unhideWhenUsed="1"/>
-    <w:lsdException w:name="Table Classic 2" w:semiHidden="1" w:unhideWhenUsed="1"/>
-    <w:lsdException w:name="Table Classic 3" w:semiHidden="1" w:unhideWhenUsed="1"/>
-    <w:lsdException w:name="Table Classic 4" w:semiHidden="1" w:unhideWhenUsed="1"/>
-    <w:lsdException w:name="Table Colorful 1" w:semiHidden="1" w:unhideWhenUsed="1"/>
-    <w:lsdException w:name="Table Colorful 2" w:semiHidden="1" w:unhideWhenUsed="1"/>
-    <w:lsdException w:name="Table Colorful 3" w:semiHidden="1" w:unhideWhenUsed="1"/>
-    <w:lsdException w:name="Table Columns 1" w:semiHidden="1" w:unhideWhenUsed="1"/>
-    <w:lsdException w:name="Table Columns 2" w:semiHidden="1" w:unhideWhenUsed="1"/>
-    <w:lsdException w:name="Table Columns 3" w:semiHidden="1" w:unhideWhenUsed="1"/>
-    <w:lsdException w:name="Table Columns 4" w:semiHidden="1" w:unhideWhenUsed="1"/>
-    <w:lsdException w:name="Table Columns 5" w:semiHidden="1" w:unhideWhenUsed="1"/>
-    <w:lsdException w:name="Table Grid 1" w:semiHidden="1" w:unhideWhenUsed="1"/>
-    <w:lsdException w:name="Table Grid 2" w:semiHidden="1" w:unhideWhenUsed="1"/>
-    <w:lsdException w:name="Table Grid 3" w:semiHidden="1" w:unhideWhenUsed="1"/>
-    <w:lsdException w:name="Table Grid 4" w:semiHidden="1" w:unhideWhenUsed="1"/>
-    <w:lsdException w:name="Table Grid 5" w:semiHidden="1" w:unhideWhenUsed="1"/>
-    <w:lsdException w:name="Table Grid 6" w:semiHidden="1" w:unhideWhenUsed="1"/>
-    <w:lsdException w:name="Table Grid 7" w:semiHidden="1" w:unhideWhenUsed="1"/>
-    <w:lsdException w:name="Table Grid 8" w:semiHidden="1" w:unhideWhenUsed="1"/>
-    <w:lsdException w:name="Table List 1" w:semiHidden="1" w:unhideWhenUsed="1"/>
-    <w:lsdException w:name="Table List 2" w:semiHidden="1" w:unhideWhenUsed="1"/>
-    <w:lsdException w:name="Table List 3" w:semiHidden="1" w:unhideWhenUsed="1"/>
-    <w:lsdException w:name="Table List 4" w:semiHidden="1" w:unhideWhenUsed="1"/>
-    <w:lsdException w:name="Table List 5" w:semiHidden="1" w:unhideWhenUsed="1"/>
-    <w:lsdException w:name="Table List 6" w:semiHidden="1" w:unhideWhenUsed="1"/>
-    <w:lsdException w:name="Table List 7" w:semiHidden="1" w:unhideWhenUsed="1"/>
-    <w:lsdException w:name="Table List 8" w:semiHidden="1" w:unhideWhenUsed="1"/>
-    <w:lsdException w:name="Table 3D effects 1" w:semiHidden="1" w:unhideWhenUsed="1"/>
-    <w:lsdException w:name="Table 3D effects 2" w:semiHidden="1" w:unhideWhenUsed="1"/>
-    <w:lsdException w:name="Table 3D effects 3" w:semiHidden="1" w:unhideWhenUsed="1"/>
-    <w:lsdException w:name="Table Contemporary" w:semiHidden="1" w:unhideWhenUsed="1"/>
-    <w:lsdException w:name="Table Elegant" w:semiHidden="1" w:unhideWhenUsed="1"/>
-    <w:lsdException w:name="Table Professional" w:semiHidden="1" w:unhideWhenUsed="1"/>
-    <w:lsdException w:name="Table Subtle 1" w:semiHidden="1" w:unhideWhenUsed="1"/>
-    <w:lsdException w:name="Table Subtle 2" w:semiHidden="1" w:unhideWhenUsed="1"/>
-    <w:lsdException w:name="Table Web 1" w:semiHidden="1" w:unhideWhenUsed="1"/>
-    <w:lsdException w:name="Table Web 2" w:semiHidden="1" w:unhideWhenUsed="1"/>
-    <w:lsdException w:name="Table Web 3" w:semiHidden="1" w:unhideWhenUsed="1"/>
-    <w:lsdException w:name="Balloon Text" w:semiHidden="1" w:unhideWhenUsed="1"/>
-    <w:lsdException w:name="Table Grid" w:uiPriority="39"/>
-    <w:lsdException w:name="Table Theme" w:semiHidden="1" w:unhideWhenUsed="1"/>
-    <w:lsdException w:name="Placeholder Text" w:semiHidden="1"/>
-    <w:lsdException w:name="No Spacing" w:uiPriority="1" w:qFormat="1"/>
-    <w:lsdException w:name="Light Shading" w:uiPriority="60"/>
-    <w:lsdException w:name="Light List" w:uiPriority="61"/>
-    <w:lsdException w:name="Light Grid" w:uiPriority="62"/>
-    <w:lsdException w:name="Medium Shading 1" w:uiPriority="63"/>
-    <w:lsdException w:name="Medium Shading 2" w:uiPriority="64"/>
-    <w:lsdException w:name="Medium List 1" w:uiPriority="65"/>
-    <w:lsdException w:name="Medium List 2" w:uiPriority="66"/>
-    <w:lsdException w:name="Medium Grid 1" w:uiPriority="67"/>
-    <w:lsdException w:name="Medium Grid 2" w:uiPriority="68"/>
-    <w:lsdException w:name="Medium Grid 3" w:uiPriority="69"/>
-    <w:lsdException w:name="Dark List" w:uiPriority="70"/>
-    <w:lsdException w:name="Colorful Shading" w:uiPriority="71"/>
-    <w:lsdException w:name="Colorful List" w:uiPriority="72"/>
-    <w:lsdException w:name="Colorful Grid" w:uiPriority="73"/>
-    <w:lsdException w:name="Light Shading Accent 1" w:uiPriority="60"/>
-    <w:lsdException w:name="Light List Accent 1" w:uiPriority="61"/>
-    <w:lsdException w:name="Light Grid Accent 1" w:uiPriority="62"/>
-    <w:lsdException w:name="Medium Shading 1 Accent 1" w:uiPriority="63"/>
-    <w:lsdException w:name="Medium Shading 2 Accent 1" w:uiPriority="64"/>
-    <w:lsdException w:name="Medium List 1 Accent 1" w:uiPriority="65"/>
-    <w:lsdException w:name="Revision" w:semiHidden="1"/>
-    <w:lsdException w:name="List Paragraph" w:uiPriority="34" w:qFormat="1"/>
-    <w:lsdException w:name="Quote" w:uiPriority="29" w:qFormat="1"/>
-    <w:lsdException w:name="Intense Quote" w:uiPriority="30" w:qFormat="1"/>
-    <w:lsdException w:name="Medium List 2 Accent 1" w:uiPriority="66"/>
-    <w:lsdException w:name="Medium Grid 1 Accent 1" w:uiPriority="67"/>
-    <w:lsdException w:name="Medium Grid 2 Accent 1" w:uiPriority="68"/>
-    <w:lsdException w:name="Medium Grid 3 Accent 1" w:uiPriority="69"/>
-    <w:lsdException w:name="Dark List Accent 1" w:uiPriority="70"/>
-    <w:lsdException w:name="Colorful Shading Accent 1" w:uiPriority="71"/>
-    <w:lsdException w:name="Colorful List Accent 1" w:uiPriority="72"/>
-    <w:lsdException w:name="Colorful Grid Accent 1" w:uiPriority="73"/>
-    <w:lsdException w:name="Light Shading Accent 2" w:uiPriority="60"/>
-    <w:lsdException w:name="Light List Accent 2" w:uiPriority="61"/>
-    <w:lsdException w:name="Light Grid Accent 2" w:uiPriority="62"/>
-    <w:lsdException w:name="Medium Shading 1 Accent 2" w:uiPriority="63"/>
-    <w:lsdException w:name="Medium Shading 2 Accent 2" w:uiPriority="64"/>
-    <w:lsdException w:name="Medium List 1 Accent 2" w:uiPriority="65"/>
-    <w:lsdException w:name="Medium List 2 Accent 2" w:uiPriority="66"/>
-    <w:lsdException w:name="Medium Grid 1 Accent 2" w:uiPriority="67"/>
-    <w:lsdException w:name="Medium Grid 2 Accent 2" w:uiPriority="68"/>
-    <w:lsdException w:name="Medium Grid 3 Accent 2" w:uiPriority="69"/>
-    <w:lsdException w:name="Dark List Accent 2" w:uiPriority="70"/>
-    <w:lsdException w:name="Colorful Shading Accent 2" w:uiPriority="71"/>
-    <w:lsdException w:name="Colorful List Accent 2" w:uiPriority="72"/>
-    <w:lsdException w:name="Colorful Grid Accent 2" w:uiPriority="73"/>
-    <w:lsdException w:name="Light Shading Accent 3" w:uiPriority="60"/>
-    <w:lsdException w:name="Light List Accent 3" w:uiPriority="61"/>
-    <w:lsdException w:name="Light Grid Accent 3" w:uiPriority="62"/>
-    <w:lsdException w:name="Medium Shading 1 Accent 3" w:uiPriority="63"/>
-    <w:lsdException w:name="Medium Shading 2 Accent 3" w:uiPriority="64"/>
-    <w:lsdException w:name="Medium List 1 Accent 3" w:uiPriority="65"/>
-    <w:lsdException w:name="Medium List 2 Accent 3" w:uiPriority="66"/>
-    <w:lsdException w:name="Medium Grid 1 Accent 3" w:uiPriority="67"/>
-    <w:lsdException w:name="Medium Grid 2 Accent 3" w:uiPriority="68"/>
-    <w:lsdException w:name="Medium Grid 3 Accent 3" w:uiPriority="69"/>
-    <w:lsdException w:name="Dark List Accent 3" w:uiPriority="70"/>
-    <w:lsdException w:name="Colorful Shading Accent 3" w:uiPriority="71"/>
-    <w:lsdException w:name="Colorful List Accent 3" w:uiPriority="72"/>
-    <w:lsdException w:name="Colorful Grid Accent 3" w:uiPriority="73"/>
-    <w:lsdException w:name="Light Shading Accent 4" w:uiPriority="60"/>
-    <w:lsdException w:name="Light List Accent 4" w:uiPriority="61"/>
-    <w:lsdException w:name="Light Grid Accent 4" w:uiPriority="62"/>
-    <w:lsdException w:name="Medium Shading 1 Accent 4" w:uiPriority="63"/>
-    <w:lsdException w:name="Medium Shading 2 Accent 4" w:uiPriority="64"/>
-    <w:lsdException w:name="Medium List 1 Accent 4" w:uiPriority="65"/>
-    <w:lsdException w:name="Medium List 2 Accent 4" w:uiPriority="66"/>
-    <w:lsdException w:name="Medium Grid 1 Accent 4" w:uiPriority="67"/>
-    <w:lsdException w:name="Medium Grid 2 Accent 4" w:uiPriority="68"/>
-    <w:lsdException w:name="Medium Grid 3 Accent 4" w:uiPriority="69"/>
-    <w:lsdException w:name="Dark List Accent 4" w:uiPriority="70"/>
-    <w:lsdException w:name="Colorful Shading Accent 4" w:uiPriority="71"/>
-    <w:lsdException w:name="Colorful List Accent 4" w:uiPriority="72"/>
-    <w:lsdException w:name="Colorful Grid Accent 4" w:uiPriority="73"/>
-    <w:lsdException w:name="Light Shading Accent 5" w:uiPriority="60"/>
-    <w:lsdException w:name="Light List Accent 5" w:uiPriority="61"/>
-    <w:lsdException w:name="Light Grid Accent 5" w:uiPriority="62"/>
-    <w:lsdException w:name="Medium Shading 1 Accent 5" w:uiPriority="63"/>
-    <w:lsdException w:name="Medium Shading 2 Accent 5" w:uiPriority="64"/>
-    <w:lsdException w:name="Medium List 1 Accent 5" w:uiPriority="65"/>
-    <w:lsdException w:name="Medium List 2 Accent 5" w:uiPriority="66"/>
-    <w:lsdException w:name="Medium Grid 1 Accent 5" w:uiPriority="67"/>
-    <w:lsdException w:name="Medium Grid 2 Accent 5" w:uiPriority="68"/>
-    <w:lsdException w:name="Medium Grid 3 Accent 5" w:uiPriority="69"/>
-    <w:lsdException w:name="Dark List Accent 5" w:uiPriority="70"/>
-    <w:lsdException w:name="Colorful Shading Accent 5" w:uiPriority="71"/>
-    <w:lsdException w:name="Colorful List Accent 5" w:uiPriority="72"/>
-    <w:lsdException w:name="Colorful Grid Accent 5" w:uiPriority="73"/>
-    <w:lsdException w:name="Light Shading Accent 6" w:uiPriority="60"/>
-    <w:lsdException w:name="Light List Accent 6" w:uiPriority="61"/>
-    <w:lsdException w:name="Light Grid Accent 6" w:uiPriority="62"/>
-    <w:lsdException w:name="Medium Shading 1 Accent 6" w:uiPriority="63"/>
-    <w:lsdException w:name="Medium Shading 2 Accent 6" w:uiPriority="64"/>
-    <w:lsdException w:name="Medium List 1 Accent 6" w:uiPriority="65"/>
-    <w:lsdException w:name="Medium List 2 Accent 6" w:uiPriority="66"/>
-    <w:lsdException w:name="Medium Grid 1 Accent 6" w:uiPriority="67"/>
-    <w:lsdException w:name="Medium Grid 2 Accent 6" w:uiPriority="68"/>
-    <w:lsdException w:name="Medium Grid 3 Accent 6" w:uiPriority="69"/>
-    <w:lsdException w:name="Dark List Accent 6" w:uiPriority="70"/>
-    <w:lsdException w:name="Colorful Shading Accent 6" w:uiPriority="71"/>
-    <w:lsdException w:name="Colorful List Accent 6" w:uiPriority="72"/>
-    <w:lsdException w:name="Colorful Grid Accent 6" w:uiPriority="73"/>
-    <w:lsdException w:name="Subtle Emphasis" w:uiPriority="19" w:qFormat="1"/>
-    <w:lsdException w:name="Intense Emphasis" w:uiPriority="21" w:qFormat="1"/>
-    <w:lsdException w:name="Subtle Reference" w:uiPriority="31" w:qFormat="1"/>
-    <w:lsdException w:name="Intense Reference" w:uiPriority="32" w:qFormat="1"/>
-    <w:lsdException w:name="Book Title" w:uiPriority="33" w:qFormat="1"/>
-    <w:lsdException w:name="Bibliography" w:semiHidden="1" w:uiPriority="37" w:unhideWhenUsed="1"/>
-    <w:lsdException w:name="TOC Heading" w:semiHidden="1" w:uiPriority="39" w:unhideWhenUsed="1" w:qFormat="1"/>
-    <w:lsdException w:name="Plain Table 1" w:uiPriority="41"/>
-    <w:lsdException w:name="Plain Table 2" w:uiPriority="42"/>
-    <w:lsdException w:name="Plain Table 3" w:uiPriority="43"/>
-    <w:lsdException w:name="Plain Table 4" w:uiPriority="44"/>
-    <w:lsdException w:name="Plain Table 5" w:uiPriority="45"/>
-    <w:lsdException w:name="Grid Table Light" w:uiPriority="40"/>
-    <w:lsdException w:name="Grid Table 1 Light" w:uiPriority="46"/>
-    <w:lsdException w:name="Grid Table 2" w:uiPriority="47"/>
-    <w:lsdException w:name="Grid Table 3" w:uiPriority="48"/>
-    <w:lsdException w:name="Grid Table 4" w:uiPriority="49"/>
-    <w:lsdException w:name="Grid Table 5 Dark" w:uiPriority="50"/>
-    <w:lsdException w:name="Grid Table 6 Colorful" w:uiPriority="51"/>
-    <w:lsdException w:name="Grid Table 7 Colorful" w:uiPriority="52"/>
-    <w:lsdException w:name="Grid Table 1 Light Accent 1" w:uiPriority="46"/>
-    <w:lsdException w:name="Grid Table 2 Accent 1" w:uiPriority="47"/>
-    <w:lsdException w:name="Grid Table 3 Accent 1" w:uiPriority="48"/>
-    <w:lsdException w:name="Grid Table 4 Accent 1" w:uiPriority="49"/>
-    <w:lsdException w:name="Grid Table 5 Dark Accent 1" w:uiPriority="50"/>
-    <w:lsdException w:name="Grid Table 6 Colorful Accent 1" w:uiPriority="51"/>
-    <w:lsdException w:name="Grid Table 7 Colorful Accent 1" w:uiPriority="52"/>
-    <w:lsdException w:name="Grid Table 1 Light Accent 2" w:uiPriority="46"/>
-    <w:lsdException w:name="Grid Table 2 Accent 2" w:uiPriority="47"/>
-    <w:lsdException w:name="Grid Table 3 Accent 2" w:uiPriority="48"/>
-    <w:lsdException w:name="Grid Table 4 Accent 2" w:uiPriority="49"/>
-    <w:lsdException w:name="Grid Table 5 Dark Accent 2" w:uiPriority="50"/>
-    <w:lsdException w:name="Grid Table 6 Colorful Accent 2" w:uiPriority="51"/>
-    <w:lsdException w:name="Grid Table 7 Colorful Accent 2" w:uiPriority="52"/>
-    <w:lsdException w:name="Grid Table 1 Light Accent 3" w:uiPriority="46"/>
-    <w:lsdException w:name="Grid Table 2 Accent 3" w:uiPriority="47"/>
-    <w:lsdException w:name="Grid Table 3 Accent 3" w:uiPriority="48"/>
-    <w:lsdException w:name="Grid Table 4 Accent 3" w:uiPriority="49"/>
-    <w:lsdException w:name="Grid Table 5 Dark Accent 3" w:uiPriority="50"/>
-    <w:lsdException w:name="Grid Table 6 Colorful Accent 3" w:uiPriority="51"/>
-    <w:lsdException w:name="Grid Table 7 Colorful Accent 3" w:uiPriority="52"/>
-    <w:lsdException w:name="Grid Table 1 Light Accent 4" w:uiPriority="46"/>
-    <w:lsdException w:name="Grid Table 2 Accent 4" w:uiPriority="47"/>
-    <w:lsdException w:name="Grid Table 3 Accent 4" w:uiPriority="48"/>
-    <w:lsdException w:name="Grid Table 4 Accent 4" w:uiPriority="49"/>
-    <w:lsdException w:name="Grid Table 5 Dark Accent 4" w:uiPriority="50"/>
-    <w:lsdException w:name="Grid Table 6 Colorful Accent 4" w:uiPriority="51"/>
-    <w:lsdException w:name="Grid Table 7 Colorful Accent 4" w:uiPriority="52"/>
-    <w:lsdException w:name="Grid Table 1 Light Accent 5" w:uiPriority="46"/>
-    <w:lsdException w:name="Grid Table 2 Accent 5" w:uiPriority="47"/>
-    <w:lsdException w:name="Grid Table 3 Accent 5" w:uiPriority="48"/>
-    <w:lsdException w:name="Grid Table 4 Accent 5" w:uiPriority="49"/>
-    <w:lsdException w:name="Grid Table 5 Dark Accent 5" w:uiPriority="50"/>
-    <w:lsdException w:name="Grid Table 6 Colorful Accent 5" w:uiPriority="51"/>
-    <w:lsdException w:name="Grid Table 7 Colorful Accent 5" w:uiPriority="52"/>
-    <w:lsdException w:name="Grid Table 1 Light Accent 6" w:uiPriority="46"/>
-    <w:lsdException w:name="Grid Table 2 Accent 6" w:uiPriority="47"/>
-    <w:lsdException w:name="Grid Table 3 Accent 6" w:uiPriority="48"/>
-    <w:lsdException w:name="Grid Table 4 Accent 6" w:uiPriority="49"/>
-    <w:lsdException w:name="Grid Table 5 Dark Accent 6" w:uiPriority="50"/>
-    <w:lsdException w:name="Grid Table 6 Colorful Accent 6" w:uiPriority="51"/>
-    <w:lsdException w:name="Grid Table 7 Colorful Accent 6" w:uiPriority="52"/>
-    <w:lsdException w:name="List Table 1 Light" w:uiPriority="46"/>
-    <w:lsdException w:name="List Table 2" w:uiPriority="47"/>
-    <w:lsdException w:name="List Table 3" w:uiPriority="48"/>
-    <w:lsdException w:name="List Table 4" w:uiPriority="49"/>
-    <w:lsdException w:name="List Table 5 Dark" w:uiPriority="50"/>
-    <w:lsdException w:name="List Table 6 Colorful" w:uiPriority="51"/>
-    <w:lsdException w:name="List Table 7 Colorful" w:uiPriority="52"/>
-    <w:lsdException w:name="List Table 1 Light Accent 1" w:uiPriority="46"/>
-    <w:lsdException w:name="List Table 2 Accent 1" w:uiPriority="47"/>
-    <w:lsdException w:name="List Table 3 Accent 1" w:uiPriority="48"/>
-    <w:lsdException w:name="List Table 4 Accent 1" w:uiPriority="49"/>
-    <w:lsdException w:name="List Table 5 Dark Accent 1" w:uiPriority="50"/>
-    <w:lsdException w:name="List Table 6 Colorful Accent 1" w:uiPriority="51"/>
-    <w:lsdException w:name="List Table 7 Colorful Accent 1" w:uiPriority="52"/>
-    <w:lsdException w:name="List Table 1 Light Accent 2" w:uiPriority="46"/>
-    <w:lsdException w:name="List Table 2 Accent 2" w:uiPriority="47"/>
-    <w:lsdException w:name="List Table 3 Accent 2" w:uiPriority="48"/>
-    <w:lsdException w:name="List Table 4 Accent 2" w:uiPriority="49"/>
-    <w:lsdException w:name="List Table 5 Dark Accent 2" w:uiPriority="50"/>
-    <w:lsdException w:name="List Table 6 Colorful Accent 2" w:uiPriority="51"/>
-    <w:lsdException w:name="List Table 7 Colorful Accent 2" w:uiPriority="52"/>
-    <w:lsdException w:name="List Table 1 Light Accent 3" w:uiPriority="46"/>
-    <w:lsdException w:name="List Table 2 Accent 3" w:uiPriority="47"/>
-    <w:lsdException w:name="List Table 3 Accent 3" w:uiPriority="48"/>
-    <w:lsdException w:name="List Table 4 Accent 3" w:uiPriority="49"/>
-    <w:lsdException w:name="List Table 5 Dark Accent 3" w:uiPriority="50"/>
-    <w:lsdException w:name="List Table 6 Colorful Accent 3" w:uiPriority="51"/>
-    <w:lsdException w:name="List Table 7 Colorful Accent 3" w:uiPriority="52"/>
-    <w:lsdException w:name="List Table 1 Light Accent 4" w:uiPriority="46"/>
-    <w:lsdException w:name="List Table 2 Accent 4" w:uiPriority="47"/>
-    <w:lsdException w:name="List Table 3 Accent 4" w:uiPriority="48"/>
-    <w:lsdException w:name="List Table 4 Accent 4" w:uiPriority="49"/>
-    <w:lsdException w:name="List Table 5 Dark Accent 4" w:uiPriority="50"/>
-    <w:lsdException w:name="List Table 6 Colorful Accent 4" w:uiPriority="51"/>
-    <w:lsdException w:name="List Table 7 Colorful Accent 4" w:uiPriority="52"/>
-    <w:lsdException w:name="List Table 1 Light Accent 5" w:uiPriority="46"/>
-    <w:lsdException w:name="List Table 2 Accent 5" w:uiPriority="47"/>
-    <w:lsdException w:name="List Table 3 Accent 5" w:uiPriority="48"/>
-    <w:lsdException w:name="List Table 4 Accent 5" w:uiPriority="49"/>
-    <w:lsdException w:name="List Table 5 Dark Accent 5" w:uiPriority="50"/>
-    <w:lsdException w:name="List Table 6 Colorful Accent 5" w:uiPriority="51"/>
-    <w:lsdException w:name="List Table 7 Colorful Accent 5" w:uiPriority="52"/>
-    <w:lsdException w:name="List Table 1 Light Accent 6" w:uiPriority="46"/>
-    <w:lsdException w:name="List Table 2 Accent 6" w:uiPriority="47"/>
-    <w:lsdException w:name="List Table 3 Accent 6" w:uiPriority="48"/>
-    <w:lsdException w:name="List Table 4 Accent 6" w:uiPriority="49"/>
-    <w:lsdException w:name="List Table 5 Dark Accent 6" w:uiPriority="50"/>
-    <w:lsdException w:name="List Table 6 Colorful Accent 6" w:uiPriority="51"/>
-    <w:lsdException w:name="List Table 7 Colorful Accent 6" w:uiPriority="52"/>
-  </w:latentStyles>
-  <w:style w:type="paragraph" w:default="1" w:styleId="Normal">
-    <w:name w:val="Normal"/>
-    <w:qFormat/>
-  </w:style>
-  <w:style w:type="character" w:default="1" w:styleId="Fuentedeprrafopredeter">
-    <w:name w:val="Default Paragraph Font"/>
-    <w:uiPriority w:val="1"/>
-    <w:semiHidden/>
-    <w:unhideWhenUsed/>
-  </w:style>
-  <w:style w:type="table" w:default="1" w:styleId="Tablanormal">
-    <w:name w:val="Normal Table"/>
-    <w:uiPriority w:val="99"/>
-    <w:semiHidden/>
-    <w:unhideWhenUsed/>
-    <w:tblPr>
-      <w:tblInd w:w="0" w:type="dxa"/>
-      <w:tblCellMar>
-        <w:top w:w="0" w:type="dxa"/>
-        <w:left w:w="108" w:type="dxa"/>
-        <w:bottom w:w="0" w:type="dxa"/>
-        <w:right w:w="108" w:type="dxa"/>
-      </w:tblCellMar>
-    </w:tblPr>
-  </w:style>
-  <w:style w:type="numbering" w:default="1" w:styleId="Sinlista">
-    <w:name w:val="No List"/>
-    <w:uiPriority w:val="99"/>
-    <w:semiHidden/>
-    <w:unhideWhenUsed/>
-  </w:style>
-</w:styles>
-</file>
-
-<file path=word/glossary/webSettings.xml><?xml version="1.0" encoding="utf-8"?>
-<w:webSettings xmlns:mc="http://schemas.openxmlformats.org/markup-compatibility/2006" xmlns:r="http://schemas.openxmlformats.org/officeDocument/2006/relationships" xmlns:w="http://schemas.openxmlformats.org/wordprocessingml/2006/main" xmlns:w14="http://schemas.microsoft.com/office/word/2010/wordml" xmlns:w15="http://schemas.microsoft.com/office/word/2012/wordml" xmlns:w16se="http://schemas.microsoft.com/office/word/2015/wordml/symex" mc:Ignorable="w14 w15 w16se"/>
 </file>
 
 <file path=word/theme/theme1.xml><?xml version="1.0" encoding="utf-8"?>
@@ -10190,12 +9812,9 @@
 </file>
 
 <file path=customXml/item1.xml><?xml version="1.0" encoding="utf-8"?>
-<?mso-contentType ?>
-<FormTemplates xmlns="http://schemas.microsoft.com/sharepoint/v3/contenttype/forms">
-  <Display>DocumentLibraryForm</Display>
-  <Edit>DocumentLibraryForm</Edit>
-  <New>DocumentLibraryForm</New>
-</FormTemplates>
+<p:properties xmlns:p="http://schemas.microsoft.com/office/2006/metadata/properties" xmlns:xsi="http://www.w3.org/2001/XMLSchema-instance" xmlns:pc="http://schemas.microsoft.com/office/infopath/2007/PartnerControls">
+  <documentManagement/>
+</p:properties>
 </file>
 
 <file path=customXml/item2.xml><?xml version="1.0" encoding="utf-8"?>
@@ -10331,9 +9950,12 @@
 </file>
 
 <file path=customXml/item3.xml><?xml version="1.0" encoding="utf-8"?>
-<p:properties xmlns:p="http://schemas.microsoft.com/office/2006/metadata/properties" xmlns:xsi="http://www.w3.org/2001/XMLSchema-instance" xmlns:pc="http://schemas.microsoft.com/office/infopath/2007/PartnerControls">
-  <documentManagement/>
-</p:properties>
+<?mso-contentType ?>
+<FormTemplates xmlns="http://schemas.microsoft.com/sharepoint/v3/contenttype/forms">
+  <Display>DocumentLibraryForm</Display>
+  <Edit>DocumentLibraryForm</Edit>
+  <New>DocumentLibraryForm</New>
+</FormTemplates>
 </file>
 
 <file path=customXml/item4.xml><?xml version="1.0" encoding="utf-8"?>
@@ -10341,9 +9963,10 @@
 </file>
 
 <file path=customXml/itemProps1.xml><?xml version="1.0" encoding="utf-8"?>
-<ds:datastoreItem xmlns:ds="http://schemas.openxmlformats.org/officeDocument/2006/customXml" ds:itemID="{DABAA964-10BA-4DBC-ABF2-CDEAC0FAF7AA}">
+<ds:datastoreItem xmlns:ds="http://schemas.openxmlformats.org/officeDocument/2006/customXml" ds:itemID="{5F1783E3-BA1C-4CA3-8E32-C9B378BBED03}">
   <ds:schemaRefs>
-    <ds:schemaRef ds:uri="http://schemas.microsoft.com/sharepoint/v3/contenttype/forms"/>
+    <ds:schemaRef ds:uri="http://schemas.microsoft.com/office/2006/metadata/properties"/>
+    <ds:schemaRef ds:uri="http://schemas.microsoft.com/office/infopath/2007/PartnerControls"/>
   </ds:schemaRefs>
 </ds:datastoreItem>
 </file>
@@ -10367,17 +9990,9 @@
 </file>
 
 <file path=customXml/itemProps3.xml><?xml version="1.0" encoding="utf-8"?>
-<ds:datastoreItem xmlns:ds="http://schemas.openxmlformats.org/officeDocument/2006/customXml" ds:itemID="{5F1783E3-BA1C-4CA3-8E32-C9B378BBED03}">
+<ds:datastoreItem xmlns:ds="http://schemas.openxmlformats.org/officeDocument/2006/customXml" ds:itemID="{DABAA964-10BA-4DBC-ABF2-CDEAC0FAF7AA}">
   <ds:schemaRefs>
-    <ds:schemaRef ds:uri="http://purl.org/dc/terms/"/>
-    <ds:schemaRef ds:uri="http://purl.org/dc/dcmitype/"/>
-    <ds:schemaRef ds:uri="http://schemas.microsoft.com/office/2006/metadata/properties"/>
-    <ds:schemaRef ds:uri="http://www.w3.org/XML/1998/namespace"/>
-    <ds:schemaRef ds:uri="http://schemas.microsoft.com/office/2006/documentManagement/types"/>
-    <ds:schemaRef ds:uri="126e8a1c-9ea9-435a-ac89-d06c80d62e30"/>
-    <ds:schemaRef ds:uri="http://purl.org/dc/elements/1.1/"/>
-    <ds:schemaRef ds:uri="http://schemas.microsoft.com/office/infopath/2007/PartnerControls"/>
-    <ds:schemaRef ds:uri="http://schemas.openxmlformats.org/package/2006/metadata/core-properties"/>
+    <ds:schemaRef ds:uri="http://schemas.microsoft.com/sharepoint/v3/contenttype/forms"/>
   </ds:schemaRefs>
 </ds:datastoreItem>
 </file>

</xml_diff>